<commit_message>
Fix mobile menu close + booking past-hours and min-duration rules
- Mobile nav: replace the CSS-only <details> (which stayed open after
  navigating) with a client MobileMenu that closes on route change, link tap,
  and click-away.
- Booking: hide already-passed hours for today (park-timezone aware) in the
  From dropdown; make To depend on From; enforce a minimum duration of 2 hours
  on weekdays and 4 hours on weekends, client-side and in createReservation.
- New shared lib/bookingRules.ts (minHoursForDate, parkNowParts).

Verified in-browser: menu auto-closes on nav; From shows only future hours when
today is selected; a 1-hour weekday booking is rejected with the min message.

Co-Authored-By: Claude Opus 4.8 <noreply@anthropic.com>
</commit_message>
<xml_diff>
--- a/Infinity-Sports-Park-AWS-Deployment-Guide.docx
+++ b/Infinity-Sports-Park-AWS-Deployment-Guide.docx
@@ -290,6 +290,36 @@
               <w:rPr>
                 <w:sz w:val="20"/>
               </w:rPr>
+              <w:t>Repository</w:t>
+            </w:r>
+          </w:p>
+        </w:tc>
+        <w:tc>
+          <w:tcPr>
+            <w:tcW w:type="dxa" w:w="6768"/>
+          </w:tcPr>
+          <w:p>
+            <w:r/>
+            <w:r>
+              <w:rPr>
+                <w:sz w:val="20"/>
+              </w:rPr>
+              <w:t>github.com/APEXBOTCODER/ISPPROJECT</w:t>
+            </w:r>
+          </w:p>
+        </w:tc>
+      </w:tr>
+      <w:tr>
+        <w:tc>
+          <w:tcPr>
+            <w:tcW w:type="dxa" w:w="2304"/>
+          </w:tcPr>
+          <w:p>
+            <w:r/>
+            <w:r>
+              <w:rPr>
+                <w:sz w:val="20"/>
+              </w:rPr>
               <w:t>Version</w:t>
             </w:r>
           </w:p>
@@ -304,7 +334,7 @@
               <w:rPr>
                 <w:sz w:val="20"/>
               </w:rPr>
-              <w:t>2.0 (detailed) — July 2026</w:t>
+              <w:t>2.1 (fully detailed) — July 2026</w:t>
             </w:r>
           </w:p>
         </w:tc>
@@ -800,7 +830,7 @@
           <w:i w:val="0"/>
           <w:sz w:val="22"/>
         </w:rPr>
-        <w:t>These keys let the website send email (SES) and SMS (SNS). We give them ONLY those two permissions.</w:t>
+        <w:t>These keys let the website send email (SES) and text messages (SNS). We grant ONLY those two permissions, so if a key ever leaks the damage is limited. (IAM = Identity and Access Management, the AWS service that controls who can do what.)</w:t>
       </w:r>
     </w:p>
     <w:p>
@@ -820,7 +850,7 @@
         <w:rPr>
           <w:b w:val="0"/>
         </w:rPr>
-        <w:t xml:space="preserve">In the top search bar, type </w:t>
+        <w:t xml:space="preserve">In the top search bar (top of the page, says “Search”), type </w:t>
       </w:r>
       <w:r>
         <w:rPr>
@@ -832,16 +862,53 @@
         <w:rPr>
           <w:b w:val="0"/>
         </w:rPr>
-        <w:t xml:space="preserve"> and click the IAM result.</w:t>
+        <w:t xml:space="preserve"> and click the </w:t>
+      </w:r>
+      <w:r>
+        <w:rPr>
+          <w:b/>
+        </w:rPr>
+        <w:t>IAM</w:t>
+      </w:r>
+      <w:r>
+        <w:rPr>
+          <w:b w:val="0"/>
+        </w:rPr>
+        <w:t xml:space="preserve"> result.</w:t>
       </w:r>
     </w:p>
     <w:p>
       <w:pPr>
+        <w:spacing w:after="120"/>
+        <w:shd w:val="clear" w:color="auto" w:fill="EAF2FB"/>
+        <w:pBdr>
+          <w:top w:val="single" w:sz="6" w:space="6" w:color="BBD4EE"/>
+          <w:left w:val="single" w:sz="6" w:space="6" w:color="BBD4EE"/>
+          <w:bottom w:val="single" w:sz="6" w:space="6" w:color="BBD4EE"/>
+          <w:right w:val="single" w:sz="6" w:space="6" w:color="BBD4EE"/>
+        </w:pBdr>
+      </w:pPr>
+      <w:r>
+        <w:rPr>
+          <w:b/>
+          <w:sz w:val="20"/>
+        </w:rPr>
+        <w:t xml:space="preserve">On screen: </w:t>
+      </w:r>
+      <w:r>
+        <w:rPr>
+          <w:sz w:val="20"/>
+        </w:rPr>
+        <w:t>The IAM dashboard, with a left-hand menu: Dashboard, User groups, Users, Roles, Policies, …</w:t>
+      </w:r>
+    </w:p>
+    <w:p>
+      <w:pPr>
         <w:pStyle w:val="ListNumber"/>
         <w:spacing w:after="60"/>
       </w:pPr>
       <w:r>
-        <w:t>Left menu: click Policies, then the blue Create policy button.</w:t>
+        <w:t>In the left menu click Policies, then the blue Create policy button (top-right).</w:t>
       </w:r>
     </w:p>
     <w:p>
@@ -850,7 +917,43 @@
         <w:spacing w:after="60"/>
       </w:pPr>
       <w:r>
-        <w:t>Click the JSON tab. Delete everything in the box and paste this:</w:t>
+        <w:rPr>
+          <w:b w:val="0"/>
+        </w:rPr>
+        <w:t xml:space="preserve">A “Specify permissions” screen appears with a </w:t>
+      </w:r>
+      <w:r>
+        <w:rPr>
+          <w:b/>
+        </w:rPr>
+        <w:t>Visual</w:t>
+      </w:r>
+      <w:r>
+        <w:rPr>
+          <w:b w:val="0"/>
+        </w:rPr>
+        <w:t xml:space="preserve"> / </w:t>
+      </w:r>
+      <w:r>
+        <w:rPr>
+          <w:b/>
+        </w:rPr>
+        <w:t>JSON</w:t>
+      </w:r>
+      <w:r>
+        <w:rPr>
+          <w:b w:val="0"/>
+        </w:rPr>
+        <w:t xml:space="preserve"> toggle near the top-right. Click the JSON tab.</w:t>
+      </w:r>
+    </w:p>
+    <w:p>
+      <w:pPr>
+        <w:pStyle w:val="ListNumber"/>
+        <w:spacing w:after="60"/>
+      </w:pPr>
+      <w:r>
+        <w:t>Click inside the code box, select all of it (Ctrl+A) and delete it, then paste this exactly:</w:t>
       </w:r>
     </w:p>
     <w:p>
@@ -926,10 +1029,19 @@
         <w:spacing w:after="60"/>
       </w:pPr>
       <w:r>
+        <w:t>Click Next (bottom-right).</w:t>
+      </w:r>
+    </w:p>
+    <w:p>
+      <w:pPr>
+        <w:pStyle w:val="ListNumber"/>
+        <w:spacing w:after="60"/>
+      </w:pPr>
+      <w:r>
         <w:rPr>
           <w:b w:val="0"/>
         </w:rPr>
-        <w:t xml:space="preserve">Click Next. For Policy name type </w:t>
+        <w:t xml:space="preserve">On the “Review and create” screen, in the Policy name box type </w:t>
       </w:r>
       <w:r>
         <w:rPr>
@@ -943,94 +1055,7 @@
         <w:rPr>
           <w:b w:val="0"/>
         </w:rPr>
-        <w:t>, then Create policy.</w:t>
-      </w:r>
-    </w:p>
-    <w:p>
-      <w:pPr>
-        <w:pStyle w:val="Heading2"/>
-      </w:pPr>
-      <w:r>
-        <w:t>3b. Create a user with that policy</w:t>
-      </w:r>
-    </w:p>
-    <w:p>
-      <w:pPr>
-        <w:pStyle w:val="ListNumber"/>
-        <w:spacing w:after="60"/>
-      </w:pPr>
-      <w:r>
-        <w:t>Left menu: click Users, then Create user.</w:t>
-      </w:r>
-    </w:p>
-    <w:p>
-      <w:pPr>
-        <w:pStyle w:val="ListNumber"/>
-        <w:spacing w:after="60"/>
-      </w:pPr>
-      <w:r>
-        <w:rPr>
-          <w:b w:val="0"/>
-        </w:rPr>
-        <w:t xml:space="preserve">User name: </w:t>
-      </w:r>
-      <w:r>
-        <w:rPr>
-          <w:rFonts w:ascii="Consolas" w:hAnsi="Consolas"/>
-          <w:b w:val="0"/>
-          <w:sz w:val="20"/>
-        </w:rPr>
-        <w:t>isp-app</w:t>
-      </w:r>
-      <w:r>
-        <w:rPr>
-          <w:b w:val="0"/>
-        </w:rPr>
-        <w:t>. Click Next.</w:t>
-      </w:r>
-    </w:p>
-    <w:p>
-      <w:pPr>
-        <w:pStyle w:val="ListNumber"/>
-        <w:spacing w:after="60"/>
-      </w:pPr>
-      <w:r>
-        <w:t>Permissions: choose “Attach policies directly,” search ISP-Messaging, tick it, click Next, then Create user.</w:t>
-      </w:r>
-    </w:p>
-    <w:p>
-      <w:pPr>
-        <w:pStyle w:val="Heading2"/>
-      </w:pPr>
-      <w:r>
-        <w:t>3c. Create the access keys</w:t>
-      </w:r>
-    </w:p>
-    <w:p>
-      <w:pPr>
-        <w:pStyle w:val="ListNumber"/>
-        <w:spacing w:after="60"/>
-      </w:pPr>
-      <w:r>
-        <w:t>Click the isp-app user you just made → the Security credentials tab.</w:t>
-      </w:r>
-    </w:p>
-    <w:p>
-      <w:pPr>
-        <w:pStyle w:val="ListNumber"/>
-        <w:spacing w:after="60"/>
-      </w:pPr>
-      <w:r>
-        <w:t>Scroll to Access keys → Create access key.</w:t>
-      </w:r>
-    </w:p>
-    <w:p>
-      <w:pPr>
-        <w:pStyle w:val="ListNumber"/>
-        <w:spacing w:after="60"/>
-      </w:pPr>
-      <w:r>
-        <w:t>Choose “Application running outside AWS” → Next → Create access key.</w:t>
+        <w:t>, then click Create policy (bottom-right).</w:t>
       </w:r>
     </w:p>
     <w:p>
@@ -1055,16 +1080,221 @@
         <w:rPr>
           <w:sz w:val="20"/>
         </w:rPr>
-        <w:t>An Access key ID and a Secret access key. This is the ONLY time the secret is shown.</w:t>
+        <w:t>A green banner: “Policy ISP-Messaging created.”</w:t>
       </w:r>
     </w:p>
     <w:p>
       <w:pPr>
+        <w:pStyle w:val="Heading2"/>
+      </w:pPr>
+      <w:r>
+        <w:t>3b. Create a user that uses that policy</w:t>
+      </w:r>
+    </w:p>
+    <w:p>
+      <w:pPr>
         <w:pStyle w:val="ListNumber"/>
         <w:spacing w:after="60"/>
       </w:pPr>
       <w:r>
-        <w:t>Click Download .csv and keep the file somewhere safe. You’ll paste both values in Part 8.</w:t>
+        <w:t>Left menu: click Users, then the blue Create user button (top-right).</w:t>
+      </w:r>
+    </w:p>
+    <w:p>
+      <w:pPr>
+        <w:pStyle w:val="ListNumber"/>
+        <w:spacing w:after="60"/>
+      </w:pPr>
+      <w:r>
+        <w:rPr>
+          <w:b w:val="0"/>
+        </w:rPr>
+        <w:t xml:space="preserve">Step 1 (User details): in User name type </w:t>
+      </w:r>
+      <w:r>
+        <w:rPr>
+          <w:rFonts w:ascii="Consolas" w:hAnsi="Consolas"/>
+          <w:b w:val="0"/>
+          <w:sz w:val="20"/>
+        </w:rPr>
+        <w:t>isp-app</w:t>
+      </w:r>
+      <w:r>
+        <w:rPr>
+          <w:b w:val="0"/>
+        </w:rPr>
+        <w:t>. Leave “Provide user access to the AWS Management Console” UNticked (this account is for the app, not a person). Click Next.</w:t>
+      </w:r>
+    </w:p>
+    <w:p>
+      <w:pPr>
+        <w:pStyle w:val="ListNumber"/>
+        <w:spacing w:after="60"/>
+      </w:pPr>
+      <w:r>
+        <w:rPr>
+          <w:b w:val="0"/>
+        </w:rPr>
+        <w:t xml:space="preserve">Step 2 (Permissions): choose the </w:t>
+      </w:r>
+      <w:r>
+        <w:rPr>
+          <w:b/>
+        </w:rPr>
+        <w:t>Attach policies directly</w:t>
+      </w:r>
+      <w:r>
+        <w:rPr>
+          <w:b w:val="0"/>
+        </w:rPr>
+        <w:t xml:space="preserve"> option. In the search box type </w:t>
+      </w:r>
+      <w:r>
+        <w:rPr>
+          <w:rFonts w:ascii="Consolas" w:hAnsi="Consolas"/>
+          <w:b w:val="0"/>
+          <w:sz w:val="20"/>
+        </w:rPr>
+        <w:t>ISP-Messaging</w:t>
+      </w:r>
+      <w:r>
+        <w:rPr>
+          <w:b w:val="0"/>
+        </w:rPr>
+        <w:t>, tick the checkbox next to it in the results, then click Next.</w:t>
+      </w:r>
+    </w:p>
+    <w:p>
+      <w:pPr>
+        <w:pStyle w:val="ListNumber"/>
+        <w:spacing w:after="60"/>
+      </w:pPr>
+      <w:r>
+        <w:t>Step 3 (Review): click Create user.</w:t>
+      </w:r>
+    </w:p>
+    <w:p>
+      <w:pPr>
+        <w:spacing w:after="120"/>
+        <w:shd w:val="clear" w:color="auto" w:fill="EAF2FB"/>
+        <w:pBdr>
+          <w:top w:val="single" w:sz="6" w:space="6" w:color="BBD4EE"/>
+          <w:left w:val="single" w:sz="6" w:space="6" w:color="BBD4EE"/>
+          <w:bottom w:val="single" w:sz="6" w:space="6" w:color="BBD4EE"/>
+          <w:right w:val="single" w:sz="6" w:space="6" w:color="BBD4EE"/>
+        </w:pBdr>
+      </w:pPr>
+      <w:r>
+        <w:rPr>
+          <w:b/>
+          <w:sz w:val="20"/>
+        </w:rPr>
+        <w:t xml:space="preserve">On screen: </w:t>
+      </w:r>
+      <w:r>
+        <w:rPr>
+          <w:sz w:val="20"/>
+        </w:rPr>
+        <w:t>The Users list now includes isp-app.</w:t>
+      </w:r>
+    </w:p>
+    <w:p>
+      <w:pPr>
+        <w:pStyle w:val="Heading2"/>
+      </w:pPr>
+      <w:r>
+        <w:t>3c. Create the access keys (the actual secret)</w:t>
+      </w:r>
+    </w:p>
+    <w:p>
+      <w:pPr>
+        <w:pStyle w:val="ListNumber"/>
+        <w:spacing w:after="60"/>
+      </w:pPr>
+      <w:r>
+        <w:t>Click the isp-app user’s name to open it, then click the Security credentials tab (near the top).</w:t>
+      </w:r>
+    </w:p>
+    <w:p>
+      <w:pPr>
+        <w:pStyle w:val="ListNumber"/>
+        <w:spacing w:after="60"/>
+      </w:pPr>
+      <w:r>
+        <w:t>Scroll down to the “Access keys” box and click Create access key (right side).</w:t>
+      </w:r>
+    </w:p>
+    <w:p>
+      <w:pPr>
+        <w:pStyle w:val="ListNumber"/>
+        <w:spacing w:after="60"/>
+      </w:pPr>
+      <w:r>
+        <w:rPr>
+          <w:b w:val="0"/>
+        </w:rPr>
+        <w:t xml:space="preserve">Use case: select </w:t>
+      </w:r>
+      <w:r>
+        <w:rPr>
+          <w:b/>
+        </w:rPr>
+        <w:t>Application running outside AWS</w:t>
+      </w:r>
+      <w:r>
+        <w:rPr>
+          <w:b w:val="0"/>
+        </w:rPr>
+        <w:t>, click Next, then Create access key.</w:t>
+      </w:r>
+    </w:p>
+    <w:p>
+      <w:pPr>
+        <w:spacing w:after="120"/>
+        <w:shd w:val="clear" w:color="auto" w:fill="EAF2FB"/>
+        <w:pBdr>
+          <w:top w:val="single" w:sz="6" w:space="6" w:color="BBD4EE"/>
+          <w:left w:val="single" w:sz="6" w:space="6" w:color="BBD4EE"/>
+          <w:bottom w:val="single" w:sz="6" w:space="6" w:color="BBD4EE"/>
+          <w:right w:val="single" w:sz="6" w:space="6" w:color="BBD4EE"/>
+        </w:pBdr>
+      </w:pPr>
+      <w:r>
+        <w:rPr>
+          <w:b/>
+          <w:sz w:val="20"/>
+        </w:rPr>
+        <w:t xml:space="preserve">On screen: </w:t>
+      </w:r>
+      <w:r>
+        <w:rPr>
+          <w:sz w:val="20"/>
+        </w:rPr>
+        <w:t>A “Retrieve access keys” page with an Access key ID and a hidden Secret access key (click Show to reveal). This is the ONLY time the secret is ever shown — you cannot get it back later.</w:t>
+      </w:r>
+    </w:p>
+    <w:p>
+      <w:pPr>
+        <w:pStyle w:val="ListNumber"/>
+        <w:spacing w:after="60"/>
+      </w:pPr>
+      <w:r>
+        <w:rPr>
+          <w:b w:val="0"/>
+        </w:rPr>
+        <w:t xml:space="preserve">Click </w:t>
+      </w:r>
+      <w:r>
+        <w:rPr>
+          <w:b/>
+        </w:rPr>
+        <w:t>Download .csv file</w:t>
+      </w:r>
+      <w:r>
+        <w:rPr>
+          <w:b w:val="0"/>
+        </w:rPr>
+        <w:t xml:space="preserve"> and save it somewhere safe. You’ll paste both values into the server’s .env in Part 8.</w:t>
       </w:r>
     </w:p>
     <w:p>
@@ -1089,7 +1319,7 @@
         <w:rPr>
           <w:sz w:val="21"/>
         </w:rPr>
-        <w:t>Treat the secret access key like a password. Never email it or commit it to code. If it leaks, return here and click Deactivate / Delete, then create a new one.</w:t>
+        <w:t>Treat the secret access key like a password. Never email it or commit it to code. If it leaks, return here and click Deactivate / Delete on the key, then create a new one.</w:t>
       </w:r>
     </w:p>
     <w:p>
@@ -1125,11 +1355,24 @@
         <w:pStyle w:val="Heading2"/>
       </w:pPr>
       <w:r>
-        <w:t>4a. Verify your domain</w:t>
+        <w:t>4a. Verify your domain (copy SES's DKIM records into your DNS)</w:t>
       </w:r>
     </w:p>
     <w:p>
       <w:pPr>
+        <w:spacing w:after="120"/>
+      </w:pPr>
+      <w:r>
+        <w:rPr>
+          <w:b w:val="0"/>
+          <w:i w:val="0"/>
+          <w:sz w:val="22"/>
+        </w:rPr>
+        <w:t>This proves you control the domain. You copy 3 records FROM AWS SES and paste them INTO your domain registrar's DNS — it is copy-and-paste, nothing is typed by hand.</w:t>
+      </w:r>
+    </w:p>
+    <w:p>
+      <w:pPr>
         <w:pStyle w:val="ListNumber"/>
         <w:spacing w:after="60"/>
       </w:pPr>
@@ -1182,7 +1425,7 @@
         <w:spacing w:after="60"/>
       </w:pPr>
       <w:r>
-        <w:t>Left menu: Configuration → Identities → Create identity.</w:t>
+        <w:t>Left menu: Configuration → Identities → click Create identity.</w:t>
       </w:r>
     </w:p>
     <w:p>
@@ -1233,7 +1476,7 @@
         <w:rPr>
           <w:sz w:val="20"/>
         </w:rPr>
-        <w:t>A list of DNS records (several CNAME records labelled DKIM).</w:t>
+        <w:t>You land on the identity's detail page for infinitysportspark.com.</w:t>
       </w:r>
     </w:p>
     <w:p>
@@ -1242,16 +1485,68 @@
         <w:spacing w:after="60"/>
       </w:pPr>
       <w:r>
-        <w:t>Keep this page open. In a NEW tab, log in to your domain registrar (where you bought the domain).</w:t>
+        <w:rPr>
+          <w:b w:val="0"/>
+        </w:rPr>
+        <w:t xml:space="preserve">On that page, find the </w:t>
+      </w:r>
+      <w:r>
+        <w:rPr>
+          <w:b/>
+        </w:rPr>
+        <w:t>Authentication</w:t>
+      </w:r>
+      <w:r>
+        <w:rPr>
+          <w:b w:val="0"/>
+        </w:rPr>
+        <w:t xml:space="preserve"> section and open </w:t>
+      </w:r>
+      <w:r>
+        <w:rPr>
+          <w:b/>
+        </w:rPr>
+        <w:t>DomainKeys Identified Mail (DKIM)</w:t>
+      </w:r>
+      <w:r>
+        <w:rPr>
+          <w:b w:val="0"/>
+        </w:rPr>
+        <w:t xml:space="preserve"> (scroll down — it is below the summary at the top).</w:t>
       </w:r>
     </w:p>
     <w:p>
       <w:pPr>
+        <w:spacing w:after="120"/>
+        <w:shd w:val="clear" w:color="auto" w:fill="EAF2FB"/>
+        <w:pBdr>
+          <w:top w:val="single" w:sz="6" w:space="6" w:color="BBD4EE"/>
+          <w:left w:val="single" w:sz="6" w:space="6" w:color="BBD4EE"/>
+          <w:bottom w:val="single" w:sz="6" w:space="6" w:color="BBD4EE"/>
+          <w:right w:val="single" w:sz="6" w:space="6" w:color="BBD4EE"/>
+        </w:pBdr>
+      </w:pPr>
+      <w:r>
+        <w:rPr>
+          <w:b/>
+          <w:sz w:val="20"/>
+        </w:rPr>
+        <w:t xml:space="preserve">On screen: </w:t>
+      </w:r>
+      <w:r>
+        <w:rPr>
+          <w:sz w:val="20"/>
+        </w:rPr>
+        <w:t>Under DKIM, a table headed roughly “Publish the following CNAME records…” with THREE rows. Each row has a Name (a.k.a. Host), a Type of CNAME, and a Value (a.k.a. Record value). Each field has a small copy icon.</w:t>
+      </w:r>
+    </w:p>
+    <w:p>
+      <w:pPr>
         <w:pStyle w:val="ListNumber"/>
         <w:spacing w:after="60"/>
       </w:pPr>
       <w:r>
-        <w:t>In the registrar’s DNS settings, add each CNAME record SES showed (copy Name and Value exactly).</w:t>
+        <w:t>Open a SECOND browser tab and sign in to your domain registrar (GoDaddy, Namecheap, Cloudflare, Squarespace, etc.), then open its DNS management page for the domain.</w:t>
       </w:r>
     </w:p>
     <w:p>
@@ -1260,15 +1555,47 @@
         <w:spacing w:after="60"/>
       </w:pPr>
       <w:r>
-        <w:t>Back in SES, wait until the identity Status shows “Verified” (minutes to a few hours; refresh).</w:t>
+        <w:t>Add all THREE records. For EACH of the 3 rows shown in SES, create one record in the registrar:</w:t>
       </w:r>
     </w:p>
     <w:p>
       <w:pPr>
-        <w:pStyle w:val="Heading2"/>
-      </w:pPr>
-      <w:r>
-        <w:t>4b. Leave the SES “sandbox” (so you can email anyone)</w:t>
+        <w:pStyle w:val="ListBullet"/>
+        <w:spacing w:after="60"/>
+        <w:ind w:left="720"/>
+      </w:pPr>
+      <w:r>
+        <w:t>Type: CNAME</w:t>
+      </w:r>
+    </w:p>
+    <w:p>
+      <w:pPr>
+        <w:pStyle w:val="ListBullet"/>
+        <w:spacing w:after="60"/>
+        <w:ind w:left="720"/>
+      </w:pPr>
+      <w:r>
+        <w:t>Name / Host: click the copy icon on the SES row's Name, then paste it into the registrar's Name/Host box.</w:t>
+      </w:r>
+    </w:p>
+    <w:p>
+      <w:pPr>
+        <w:pStyle w:val="ListBullet"/>
+        <w:spacing w:after="60"/>
+        <w:ind w:left="720"/>
+      </w:pPr>
+      <w:r>
+        <w:t>Value / Points to / Target: copy the SES row's Value and paste it into the registrar's Value box.</w:t>
+      </w:r>
+    </w:p>
+    <w:p>
+      <w:pPr>
+        <w:pStyle w:val="ListBullet"/>
+        <w:spacing w:after="60"/>
+        <w:ind w:left="720"/>
+      </w:pPr>
+      <w:r>
+        <w:t>TTL: leave the default. Save the record, then repeat for rows 2 and 3.</w:t>
       </w:r>
     </w:p>
     <w:p>
@@ -1293,6 +1620,73 @@
         <w:rPr>
           <w:sz w:val="21"/>
         </w:rPr>
+        <w:t>Common gotcha — the registrar adds the domain for you. SES shows a full Name like abcd1234._domainkey.infinitysportspark.com, but many registrars automatically append “.infinitysportspark.com”, so you paste only the part BEFORE it (abcd1234._domainkey). If verification is stuck after a few hours, this is almost always why — remove the trailing domain from the Name (or re-add it) and save.</w:t>
+      </w:r>
+    </w:p>
+    <w:p>
+      <w:pPr>
+        <w:pStyle w:val="ListNumber"/>
+        <w:spacing w:after="60"/>
+      </w:pPr>
+      <w:r>
+        <w:t>Go back to the SES tab, refresh, and wait until the identity Status shows “Verified” (a few minutes to a few hours).</w:t>
+      </w:r>
+    </w:p>
+    <w:p>
+      <w:pPr>
+        <w:spacing w:after="160"/>
+        <w:shd w:val="clear" w:color="auto" w:fill="FFF6E5"/>
+        <w:pBdr>
+          <w:top w:val="single" w:sz="6" w:space="6" w:color="D0D0D0"/>
+          <w:left w:val="single" w:sz="6" w:space="6" w:color="D0D0D0"/>
+          <w:bottom w:val="single" w:sz="6" w:space="6" w:color="D0D0D0"/>
+          <w:right w:val="single" w:sz="6" w:space="6" w:color="D0D0D0"/>
+        </w:pBdr>
+      </w:pPr>
+      <w:r>
+        <w:rPr>
+          <w:b/>
+          <w:sz w:val="21"/>
+        </w:rPr>
+        <w:t xml:space="preserve">Note: </w:t>
+      </w:r>
+      <w:r>
+        <w:rPr>
+          <w:sz w:val="21"/>
+        </w:rPr>
+        <w:t>Someone else owns the domain? You don't need to own it — you only need these 3 records added to its DNS. Either send the 3 Name/Value pairs to the owner to paste in, or ask them to delegate DNS access (or point the domain's nameservers at an Amazon Route 53 zone in your AWS account so you manage it yourself).</w:t>
+      </w:r>
+    </w:p>
+    <w:p>
+      <w:pPr>
+        <w:pStyle w:val="Heading2"/>
+      </w:pPr>
+      <w:r>
+        <w:t>4b. Leave the SES “sandbox” (so you can email anyone)</w:t>
+      </w:r>
+    </w:p>
+    <w:p>
+      <w:pPr>
+        <w:spacing w:after="160"/>
+        <w:shd w:val="clear" w:color="auto" w:fill="FDECEA"/>
+        <w:pBdr>
+          <w:top w:val="single" w:sz="6" w:space="6" w:color="D0D0D0"/>
+          <w:left w:val="single" w:sz="6" w:space="6" w:color="D0D0D0"/>
+          <w:bottom w:val="single" w:sz="6" w:space="6" w:color="D0D0D0"/>
+          <w:right w:val="single" w:sz="6" w:space="6" w:color="D0D0D0"/>
+        </w:pBdr>
+      </w:pPr>
+      <w:r>
+        <w:rPr>
+          <w:b/>
+          <w:sz w:val="21"/>
+        </w:rPr>
+        <w:t xml:space="preserve">IMPORTANT: </w:t>
+      </w:r>
+      <w:r>
+        <w:rPr>
+          <w:sz w:val="21"/>
+        </w:rPr>
         <w:t>New SES accounts start in a ‘sandbox’ and can only email addresses you’ve verified. You must request production access before real customers can receive email.</w:t>
       </w:r>
     </w:p>
@@ -1465,7 +1859,7 @@
           <w:i w:val="0"/>
           <w:sz w:val="22"/>
         </w:rPr>
-        <w:t>Phone verification is optional. You can skip this now (leave SMS off) and enable it later.</w:t>
+        <w:t>Phone verification is OPTIONAL for booking. You can skip this whole part now (leave SMS off) and turn it on later without changing anything else. Do this only if you want text-message codes.</w:t>
       </w:r>
     </w:p>
     <w:p>
@@ -1477,19 +1871,19 @@
         <w:rPr>
           <w:b w:val="0"/>
         </w:rPr>
-        <w:t xml:space="preserve">Top search bar: </w:t>
+        <w:t xml:space="preserve">Confirm the region (top-right) is </w:t>
       </w:r>
       <w:r>
         <w:rPr>
           <w:b/>
         </w:rPr>
-        <w:t>SNS</w:t>
+        <w:t>us-east-1</w:t>
       </w:r>
       <w:r>
         <w:rPr>
           <w:b w:val="0"/>
         </w:rPr>
-        <w:t xml:space="preserve"> → “Amazon Simple Notification Service.”</w:t>
+        <w:t xml:space="preserve"> — the same one you used for SES.</w:t>
       </w:r>
     </w:p>
     <w:p>
@@ -1498,16 +1892,165 @@
         <w:spacing w:after="60"/>
       </w:pPr>
       <w:r>
-        <w:t>Left menu: Mobile → Text messaging (SMS).</w:t>
+        <w:rPr>
+          <w:b w:val="0"/>
+        </w:rPr>
+        <w:t xml:space="preserve">Top search bar: type </w:t>
+      </w:r>
+      <w:r>
+        <w:rPr>
+          <w:b/>
+        </w:rPr>
+        <w:t>SNS</w:t>
+      </w:r>
+      <w:r>
+        <w:rPr>
+          <w:b w:val="0"/>
+        </w:rPr>
+        <w:t xml:space="preserve"> → click “Amazon Simple Notification Service.”</w:t>
       </w:r>
     </w:p>
     <w:p>
       <w:pPr>
+        <w:spacing w:after="120"/>
+        <w:shd w:val="clear" w:color="auto" w:fill="EAF2FB"/>
+        <w:pBdr>
+          <w:top w:val="single" w:sz="6" w:space="6" w:color="BBD4EE"/>
+          <w:left w:val="single" w:sz="6" w:space="6" w:color="BBD4EE"/>
+          <w:bottom w:val="single" w:sz="6" w:space="6" w:color="BBD4EE"/>
+          <w:right w:val="single" w:sz="6" w:space="6" w:color="BBD4EE"/>
+        </w:pBdr>
+      </w:pPr>
+      <w:r>
+        <w:rPr>
+          <w:b/>
+          <w:sz w:val="20"/>
+        </w:rPr>
+        <w:t xml:space="preserve">On screen: </w:t>
+      </w:r>
+      <w:r>
+        <w:rPr>
+          <w:sz w:val="20"/>
+        </w:rPr>
+        <w:t>The SNS dashboard with a left menu (Dashboard, Topics, Subscriptions, and a “Mobile” group).</w:t>
+      </w:r>
+    </w:p>
+    <w:p>
+      <w:pPr>
         <w:pStyle w:val="ListNumber"/>
         <w:spacing w:after="60"/>
       </w:pPr>
       <w:r>
-        <w:t>Click Edit under Account SMS settings → set a Monthly spending limit (e.g. 5 USD) → set Default message type to Transactional → Save.</w:t>
+        <w:t>Left menu: expand Mobile → click Text messaging (SMS).</w:t>
+      </w:r>
+    </w:p>
+    <w:p>
+      <w:pPr>
+        <w:pStyle w:val="ListNumber"/>
+        <w:spacing w:after="60"/>
+      </w:pPr>
+      <w:r>
+        <w:rPr>
+          <w:b w:val="0"/>
+        </w:rPr>
+        <w:t xml:space="preserve">Find the “Account SMS settings” box and click </w:t>
+      </w:r>
+      <w:r>
+        <w:rPr>
+          <w:b/>
+        </w:rPr>
+        <w:t>Edit</w:t>
+      </w:r>
+      <w:r>
+        <w:rPr>
+          <w:b w:val="0"/>
+        </w:rPr>
+        <w:t>.</w:t>
+      </w:r>
+    </w:p>
+    <w:p>
+      <w:pPr>
+        <w:pStyle w:val="ListNumber"/>
+        <w:spacing w:after="60"/>
+      </w:pPr>
+      <w:r>
+        <w:rPr>
+          <w:b w:val="0"/>
+        </w:rPr>
+        <w:t xml:space="preserve">Set </w:t>
+      </w:r>
+      <w:r>
+        <w:rPr>
+          <w:b/>
+        </w:rPr>
+        <w:t>Account spend limit</w:t>
+      </w:r>
+      <w:r>
+        <w:rPr>
+          <w:b w:val="0"/>
+        </w:rPr>
+        <w:t xml:space="preserve"> to a small number (e.g. 5 USD) so costs can never surprise you.</w:t>
+      </w:r>
+    </w:p>
+    <w:p>
+      <w:pPr>
+        <w:pStyle w:val="ListNumber"/>
+        <w:spacing w:after="60"/>
+      </w:pPr>
+      <w:r>
+        <w:rPr>
+          <w:b w:val="0"/>
+        </w:rPr>
+        <w:t xml:space="preserve">Set </w:t>
+      </w:r>
+      <w:r>
+        <w:rPr>
+          <w:b/>
+        </w:rPr>
+        <w:t>Default message type</w:t>
+      </w:r>
+      <w:r>
+        <w:rPr>
+          <w:b w:val="0"/>
+        </w:rPr>
+        <w:t xml:space="preserve"> to </w:t>
+      </w:r>
+      <w:r>
+        <w:rPr>
+          <w:b/>
+        </w:rPr>
+        <w:t>Transactional</w:t>
+      </w:r>
+      <w:r>
+        <w:rPr>
+          <w:b w:val="0"/>
+        </w:rPr>
+        <w:t xml:space="preserve"> (best deliverability for one-time codes), then click Save changes.</w:t>
+      </w:r>
+    </w:p>
+    <w:p>
+      <w:pPr>
+        <w:spacing w:after="120"/>
+        <w:shd w:val="clear" w:color="auto" w:fill="EAF2FB"/>
+        <w:pBdr>
+          <w:top w:val="single" w:sz="6" w:space="6" w:color="BBD4EE"/>
+          <w:left w:val="single" w:sz="6" w:space="6" w:color="BBD4EE"/>
+          <w:bottom w:val="single" w:sz="6" w:space="6" w:color="BBD4EE"/>
+          <w:right w:val="single" w:sz="6" w:space="6" w:color="BBD4EE"/>
+        </w:pBdr>
+      </w:pPr>
+      <w:r>
+        <w:rPr>
+          <w:b/>
+          <w:sz w:val="20"/>
+        </w:rPr>
+        <w:t xml:space="preserve">On screen: </w:t>
+      </w:r>
+      <w:r>
+        <w:rPr>
+          <w:sz w:val="20"/>
+        </w:rPr>
+        <w:t>The Text messaging (SMS) page showing your spend limit and “Transactional” as the default type.</w:t>
       </w:r>
     </w:p>
     <w:p>
@@ -1532,7 +2075,39 @@
         <w:rPr>
           <w:sz w:val="21"/>
         </w:rPr>
-        <w:t>To text US mobile numbers you must register for A2P 10DLC (Left menu → Text messaging → Origination). This can take a few days to ~2 weeks and has small fees. Until then, keep SMS off (Part 8 uses SMS_PROVIDER=console).</w:t>
+        <w:t>To text US mobile numbers, US carriers require A2P 10DLC registration (a one-time brand + campaign). Do it under Left menu → Mobile → Text messaging (SMS) → the Origination / Sender ID area (or in the AWS End User Messaging console). It can take a few days to ~2 weeks and has small fees (~$2/mo). Until it is approved, leave SMS off — Part 8 uses SMS_PROVIDER=console.</w:t>
+      </w:r>
+    </w:p>
+    <w:p>
+      <w:pPr>
+        <w:spacing w:after="40"/>
+      </w:pPr>
+      <w:r>
+        <w:rPr>
+          <w:b w:val="0"/>
+          <w:i w:val="0"/>
+          <w:sz w:val="22"/>
+        </w:rPr>
+        <w:t>Value you’ll set in Part 8 only when SMS is ready:</w:t>
+      </w:r>
+    </w:p>
+    <w:p>
+      <w:pPr>
+        <w:spacing w:after="160" w:before="80"/>
+        <w:shd w:val="clear" w:color="auto" w:fill="F2F3F5"/>
+        <w:pBdr>
+          <w:top w:val="single" w:sz="6" w:space="6" w:color="D0D0D0"/>
+          <w:left w:val="single" w:sz="6" w:space="6" w:color="D0D0D0"/>
+          <w:bottom w:val="single" w:sz="6" w:space="6" w:color="D0D0D0"/>
+          <w:right w:val="single" w:sz="6" w:space="6" w:color="D0D0D0"/>
+        </w:pBdr>
+      </w:pPr>
+      <w:r>
+        <w:rPr>
+          <w:rFonts w:ascii="Consolas" w:hAnsi="Consolas"/>
+          <w:sz w:val="19"/>
+        </w:rPr>
+        <w:t>SMS_PROVIDER=sns</w:t>
       </w:r>
     </w:p>
     <w:p>
@@ -1552,6 +2127,19 @@
     </w:p>
     <w:p>
       <w:pPr>
+        <w:spacing w:after="120"/>
+      </w:pPr>
+      <w:r>
+        <w:rPr>
+          <w:b w:val="0"/>
+          <w:i w:val="0"/>
+          <w:sz w:val="22"/>
+        </w:rPr>
+        <w:t>Lightsail is the simple, fixed-price corner of AWS. This one small server runs the website and holds the database file.</w:t>
+      </w:r>
+    </w:p>
+    <w:p>
+      <w:pPr>
         <w:pStyle w:val="ListNumber"/>
         <w:spacing w:after="60"/>
       </w:pPr>
@@ -1559,7 +2147,7 @@
         <w:rPr>
           <w:b w:val="0"/>
         </w:rPr>
-        <w:t xml:space="preserve">Go to </w:t>
+        <w:t xml:space="preserve">Open </w:t>
       </w:r>
       <w:r>
         <w:rPr>
@@ -1573,123 +2161,7 @@
         <w:rPr>
           <w:b w:val="0"/>
         </w:rPr>
-        <w:t xml:space="preserve"> (sign in if asked).</w:t>
-      </w:r>
-    </w:p>
-    <w:p>
-      <w:pPr>
-        <w:pStyle w:val="ListNumber"/>
-        <w:spacing w:after="60"/>
-      </w:pPr>
-      <w:r>
-        <w:t>Click Create instance.</w:t>
-      </w:r>
-    </w:p>
-    <w:p>
-      <w:pPr>
-        <w:pStyle w:val="ListNumber"/>
-        <w:spacing w:after="60"/>
-      </w:pPr>
-      <w:r>
-        <w:t>Instance location: confirm it’s your region; if not, click Change and pick it.</w:t>
-      </w:r>
-    </w:p>
-    <w:p>
-      <w:pPr>
-        <w:pStyle w:val="ListNumber"/>
-        <w:spacing w:after="60"/>
-      </w:pPr>
-      <w:r>
-        <w:rPr>
-          <w:b w:val="0"/>
-        </w:rPr>
-        <w:t xml:space="preserve">Pick your platform: </w:t>
-      </w:r>
-      <w:r>
-        <w:rPr>
-          <w:b/>
-        </w:rPr>
-        <w:t>Linux/Unix</w:t>
-      </w:r>
-      <w:r>
-        <w:rPr>
-          <w:b w:val="0"/>
-        </w:rPr>
-        <w:t>.</w:t>
-      </w:r>
-    </w:p>
-    <w:p>
-      <w:pPr>
-        <w:pStyle w:val="ListNumber"/>
-        <w:spacing w:after="60"/>
-      </w:pPr>
-      <w:r>
-        <w:rPr>
-          <w:b w:val="0"/>
-        </w:rPr>
-        <w:t xml:space="preserve">Select a blueprint: choose </w:t>
-      </w:r>
-      <w:r>
-        <w:rPr>
-          <w:b/>
-        </w:rPr>
-        <w:t>OS Only → Ubuntu 22.04 LTS</w:t>
-      </w:r>
-      <w:r>
-        <w:rPr>
-          <w:b w:val="0"/>
-        </w:rPr>
-        <w:t>.</w:t>
-      </w:r>
-    </w:p>
-    <w:p>
-      <w:pPr>
-        <w:pStyle w:val="ListNumber"/>
-        <w:spacing w:after="60"/>
-      </w:pPr>
-      <w:r>
-        <w:rPr>
-          <w:b w:val="0"/>
-        </w:rPr>
-        <w:t xml:space="preserve">Choose your instance plan: pick the </w:t>
-      </w:r>
-      <w:r>
-        <w:rPr>
-          <w:b/>
-        </w:rPr>
-        <w:t>$5/month</w:t>
-      </w:r>
-      <w:r>
-        <w:rPr>
-          <w:b w:val="0"/>
-        </w:rPr>
-        <w:t xml:space="preserve"> plan (1 GB RAM, 40 GB SSD). (The first month may be free.)</w:t>
-      </w:r>
-    </w:p>
-    <w:p>
-      <w:pPr>
-        <w:pStyle w:val="ListNumber"/>
-        <w:spacing w:after="60"/>
-      </w:pPr>
-      <w:r>
-        <w:rPr>
-          <w:b w:val="0"/>
-        </w:rPr>
-        <w:t xml:space="preserve">Name your instance </w:t>
-      </w:r>
-      <w:r>
-        <w:rPr>
-          <w:rFonts w:ascii="Consolas" w:hAnsi="Consolas"/>
-          <w:b w:val="0"/>
-          <w:sz w:val="20"/>
-        </w:rPr>
-        <w:t>isp-web</w:t>
-      </w:r>
-      <w:r>
-        <w:rPr>
-          <w:b w:val="0"/>
-        </w:rPr>
-        <w:t>, then click Create instance.</w:t>
+        <w:t xml:space="preserve"> in your browser and sign in with the same AWS account if asked.</w:t>
       </w:r>
     </w:p>
     <w:p>
@@ -1714,15 +2186,16 @@
         <w:rPr>
           <w:sz w:val="20"/>
         </w:rPr>
-        <w:t>The instance appears with status “Pending,” then “Running” after ~1 minute.</w:t>
+        <w:t>The Lightsail home page with an orange Create instance button.</w:t>
       </w:r>
     </w:p>
     <w:p>
       <w:pPr>
-        <w:pStyle w:val="Heading2"/>
-      </w:pPr>
-      <w:r>
-        <w:t>6a. Give it a fixed IP address</w:t>
+        <w:pStyle w:val="ListNumber"/>
+        <w:spacing w:after="60"/>
+      </w:pPr>
+      <w:r>
+        <w:t>Click Create instance.</w:t>
       </w:r>
     </w:p>
     <w:p>
@@ -1731,7 +2204,22 @@
         <w:spacing w:after="60"/>
       </w:pPr>
       <w:r>
-        <w:t>Top menu: Networking → Create static IP.</w:t>
+        <w:rPr>
+          <w:b w:val="0"/>
+        </w:rPr>
+        <w:t xml:space="preserve">Instance location: it shows a region + Availability Zone near the top. Confirm the region matches yours; if not, click </w:t>
+      </w:r>
+      <w:r>
+        <w:rPr>
+          <w:b/>
+        </w:rPr>
+        <w:t>Change AWS Region and Availability Zone</w:t>
+      </w:r>
+      <w:r>
+        <w:rPr>
+          <w:b w:val="0"/>
+        </w:rPr>
+        <w:t xml:space="preserve"> and pick it.</w:t>
       </w:r>
     </w:p>
     <w:p>
@@ -1743,7 +2231,91 @@
         <w:rPr>
           <w:b w:val="0"/>
         </w:rPr>
-        <w:t xml:space="preserve">Attach it to </w:t>
+        <w:t xml:space="preserve">Under “Select a platform,” click </w:t>
+      </w:r>
+      <w:r>
+        <w:rPr>
+          <w:b/>
+        </w:rPr>
+        <w:t>Linux/Unix</w:t>
+      </w:r>
+      <w:r>
+        <w:rPr>
+          <w:b w:val="0"/>
+        </w:rPr>
+        <w:t>.</w:t>
+      </w:r>
+    </w:p>
+    <w:p>
+      <w:pPr>
+        <w:pStyle w:val="ListNumber"/>
+        <w:spacing w:after="60"/>
+      </w:pPr>
+      <w:r>
+        <w:rPr>
+          <w:b w:val="0"/>
+        </w:rPr>
+        <w:t xml:space="preserve">Under “Select a blueprint,” click the </w:t>
+      </w:r>
+      <w:r>
+        <w:rPr>
+          <w:b/>
+        </w:rPr>
+        <w:t>OS Only</w:t>
+      </w:r>
+      <w:r>
+        <w:rPr>
+          <w:b w:val="0"/>
+        </w:rPr>
+        <w:t xml:space="preserve"> tab and choose </w:t>
+      </w:r>
+      <w:r>
+        <w:rPr>
+          <w:b/>
+        </w:rPr>
+        <w:t>Ubuntu 22.04 LTS</w:t>
+      </w:r>
+      <w:r>
+        <w:rPr>
+          <w:b w:val="0"/>
+        </w:rPr>
+        <w:t xml:space="preserve"> (not an app blueprint).</w:t>
+      </w:r>
+    </w:p>
+    <w:p>
+      <w:pPr>
+        <w:pStyle w:val="ListNumber"/>
+        <w:spacing w:after="60"/>
+      </w:pPr>
+      <w:r>
+        <w:rPr>
+          <w:b w:val="0"/>
+        </w:rPr>
+        <w:t xml:space="preserve">Scroll to “Choose your instance plan” and select the </w:t>
+      </w:r>
+      <w:r>
+        <w:rPr>
+          <w:b/>
+        </w:rPr>
+        <w:t>$5 USD/month</w:t>
+      </w:r>
+      <w:r>
+        <w:rPr>
+          <w:b w:val="0"/>
+        </w:rPr>
+        <w:t xml:space="preserve"> plan (1 GB RAM, 2 vCPUs, 40 GB SSD). The first 3 months may be free.</w:t>
+      </w:r>
+    </w:p>
+    <w:p>
+      <w:pPr>
+        <w:pStyle w:val="ListNumber"/>
+        <w:spacing w:after="60"/>
+      </w:pPr>
+      <w:r>
+        <w:rPr>
+          <w:b w:val="0"/>
+        </w:rPr>
+        <w:t xml:space="preserve">At the bottom, under “Identify your instance,” replace the default name with </w:t>
       </w:r>
       <w:r>
         <w:rPr>
@@ -1757,104 +2329,7 @@
         <w:rPr>
           <w:b w:val="0"/>
         </w:rPr>
-        <w:t xml:space="preserve">, name it </w:t>
-      </w:r>
-      <w:r>
-        <w:rPr>
-          <w:rFonts w:ascii="Consolas" w:hAnsi="Consolas"/>
-          <w:b w:val="0"/>
-          <w:sz w:val="20"/>
-        </w:rPr>
-        <w:t>isp-ip</w:t>
-      </w:r>
-      <w:r>
-        <w:rPr>
-          <w:b w:val="0"/>
-        </w:rPr>
-        <w:t>, click Create.</w:t>
-      </w:r>
-    </w:p>
-    <w:p>
-      <w:pPr>
-        <w:pStyle w:val="ListNumber"/>
-        <w:spacing w:after="60"/>
-      </w:pPr>
-      <w:r>
-        <w:t>Write down this static IP address — you’ll point your domain at it (Part 9).</w:t>
-      </w:r>
-    </w:p>
-    <w:p>
-      <w:pPr>
-        <w:pStyle w:val="Heading2"/>
-      </w:pPr>
-      <w:r>
-        <w:t>6b. Open the firewall ports</w:t>
-      </w:r>
-    </w:p>
-    <w:p>
-      <w:pPr>
-        <w:pStyle w:val="ListNumber"/>
-        <w:spacing w:after="60"/>
-      </w:pPr>
-      <w:r>
-        <w:t>Click the isp-web instance → Networking tab.</w:t>
-      </w:r>
-    </w:p>
-    <w:p>
-      <w:pPr>
-        <w:pStyle w:val="ListNumber"/>
-        <w:spacing w:after="60"/>
-      </w:pPr>
-      <w:r>
-        <w:t>Under IPv4 Firewall, make sure these rules exist (Add rule if missing): SSH (22), HTTP (80), HTTPS (443).</w:t>
-      </w:r>
-    </w:p>
-    <w:p>
-      <w:pPr>
-        <w:pBdr>
-          <w:bottom w:val="single" w:sz="6" w:space="1" w:color="BBBBBB"/>
-        </w:pBdr>
-      </w:pPr>
-    </w:p>
-    <w:p>
-      <w:pPr>
-        <w:pStyle w:val="Heading1"/>
-      </w:pPr>
-      <w:r>
-        <w:t>Part 7 · Connect to the server and install software</w:t>
-      </w:r>
-    </w:p>
-    <w:p>
-      <w:pPr>
-        <w:pStyle w:val="ListNumber"/>
-        <w:spacing w:after="60"/>
-      </w:pPr>
-      <w:r>
-        <w:t>In Lightsail, click the isp-web instance.</w:t>
-      </w:r>
-    </w:p>
-    <w:p>
-      <w:pPr>
-        <w:pStyle w:val="ListNumber"/>
-        <w:spacing w:after="60"/>
-      </w:pPr>
-      <w:r>
-        <w:rPr>
-          <w:b w:val="0"/>
-        </w:rPr>
-        <w:t xml:space="preserve">Click the orange </w:t>
-      </w:r>
-      <w:r>
-        <w:rPr>
-          <w:b/>
-        </w:rPr>
-        <w:t>Connect using SSH</w:t>
-      </w:r>
-      <w:r>
-        <w:rPr>
-          <w:b w:val="0"/>
-        </w:rPr>
-        <w:t xml:space="preserve"> button. A black terminal window opens in your browser — no setup needed.</w:t>
+        <w:t>, then click the orange Create instance button.</w:t>
       </w:r>
     </w:p>
     <w:p>
@@ -1879,12 +2354,238 @@
         <w:rPr>
           <w:sz w:val="20"/>
         </w:rPr>
-        <w:t>A terminal prompt like  ubuntu@ip-172-26-x-x:~$</w:t>
+        <w:t>You return to the home page; the isp-web card shows “Pending,” then “Running” after ~1 minute.</w:t>
       </w:r>
     </w:p>
     <w:p>
       <w:pPr>
-        <w:spacing w:after="40"/>
+        <w:pStyle w:val="Heading2"/>
+      </w:pPr>
+      <w:r>
+        <w:t>6a. Give it a fixed IP address (so it never changes)</w:t>
+      </w:r>
+    </w:p>
+    <w:p>
+      <w:pPr>
+        <w:pStyle w:val="ListNumber"/>
+        <w:spacing w:after="60"/>
+      </w:pPr>
+      <w:r>
+        <w:rPr>
+          <w:b w:val="0"/>
+        </w:rPr>
+        <w:t xml:space="preserve">At the top of the Lightsail page click the </w:t>
+      </w:r>
+      <w:r>
+        <w:rPr>
+          <w:b/>
+        </w:rPr>
+        <w:t>Networking</w:t>
+      </w:r>
+      <w:r>
+        <w:rPr>
+          <w:b w:val="0"/>
+        </w:rPr>
+        <w:t xml:space="preserve"> tab.</w:t>
+      </w:r>
+    </w:p>
+    <w:p>
+      <w:pPr>
+        <w:pStyle w:val="ListNumber"/>
+        <w:spacing w:after="60"/>
+      </w:pPr>
+      <w:r>
+        <w:t>Click Create static IP.</w:t>
+      </w:r>
+    </w:p>
+    <w:p>
+      <w:pPr>
+        <w:pStyle w:val="ListNumber"/>
+        <w:spacing w:after="60"/>
+      </w:pPr>
+      <w:r>
+        <w:rPr>
+          <w:b w:val="0"/>
+        </w:rPr>
+        <w:t xml:space="preserve">Under “Attach to an instance,” select </w:t>
+      </w:r>
+      <w:r>
+        <w:rPr>
+          <w:rFonts w:ascii="Consolas" w:hAnsi="Consolas"/>
+          <w:b w:val="0"/>
+          <w:sz w:val="20"/>
+        </w:rPr>
+        <w:t>isp-web</w:t>
+      </w:r>
+      <w:r>
+        <w:rPr>
+          <w:b w:val="0"/>
+        </w:rPr>
+        <w:t xml:space="preserve"> from the dropdown. In the name box at the bottom type </w:t>
+      </w:r>
+      <w:r>
+        <w:rPr>
+          <w:rFonts w:ascii="Consolas" w:hAnsi="Consolas"/>
+          <w:b w:val="0"/>
+          <w:sz w:val="20"/>
+        </w:rPr>
+        <w:t>isp-ip</w:t>
+      </w:r>
+      <w:r>
+        <w:rPr>
+          <w:b w:val="0"/>
+        </w:rPr>
+        <w:t>, then click Create.</w:t>
+      </w:r>
+    </w:p>
+    <w:p>
+      <w:pPr>
+        <w:spacing w:after="120"/>
+        <w:shd w:val="clear" w:color="auto" w:fill="EAF2FB"/>
+        <w:pBdr>
+          <w:top w:val="single" w:sz="6" w:space="6" w:color="BBD4EE"/>
+          <w:left w:val="single" w:sz="6" w:space="6" w:color="BBD4EE"/>
+          <w:bottom w:val="single" w:sz="6" w:space="6" w:color="BBD4EE"/>
+          <w:right w:val="single" w:sz="6" w:space="6" w:color="BBD4EE"/>
+        </w:pBdr>
+      </w:pPr>
+      <w:r>
+        <w:rPr>
+          <w:b/>
+          <w:sz w:val="20"/>
+        </w:rPr>
+        <w:t xml:space="preserve">On screen: </w:t>
+      </w:r>
+      <w:r>
+        <w:rPr>
+          <w:sz w:val="20"/>
+        </w:rPr>
+        <w:t>The static IP page shows an IP address like 52.x.x.x, “Attached to isp-web.”</w:t>
+      </w:r>
+    </w:p>
+    <w:p>
+      <w:pPr>
+        <w:pStyle w:val="ListNumber"/>
+        <w:spacing w:after="60"/>
+      </w:pPr>
+      <w:r>
+        <w:t>Write this IP address down — you point your domain at it in Part 10.</w:t>
+      </w:r>
+    </w:p>
+    <w:p>
+      <w:pPr>
+        <w:pStyle w:val="Heading2"/>
+      </w:pPr>
+      <w:r>
+        <w:t>6b. Open the firewall ports</w:t>
+      </w:r>
+    </w:p>
+    <w:p>
+      <w:pPr>
+        <w:pStyle w:val="ListNumber"/>
+        <w:spacing w:after="60"/>
+      </w:pPr>
+      <w:r>
+        <w:t>Back on the home page, click the isp-web instance, then open its Networking tab.</w:t>
+      </w:r>
+    </w:p>
+    <w:p>
+      <w:pPr>
+        <w:pStyle w:val="ListNumber"/>
+        <w:spacing w:after="60"/>
+      </w:pPr>
+      <w:r>
+        <w:rPr>
+          <w:b w:val="0"/>
+        </w:rPr>
+        <w:t xml:space="preserve">Scroll to the </w:t>
+      </w:r>
+      <w:r>
+        <w:rPr>
+          <w:b/>
+        </w:rPr>
+        <w:t>IPv4 Firewall</w:t>
+      </w:r>
+      <w:r>
+        <w:rPr>
+          <w:b w:val="0"/>
+        </w:rPr>
+        <w:t xml:space="preserve"> table. Make sure these three rules are present; click “Add rule” for any that is missing:</w:t>
+      </w:r>
+    </w:p>
+    <w:p>
+      <w:pPr>
+        <w:pStyle w:val="ListBullet"/>
+        <w:spacing w:after="60"/>
+        <w:ind w:left="720"/>
+      </w:pPr>
+      <w:r>
+        <w:t>SSH — TCP — port 22 (usually already there)</w:t>
+      </w:r>
+    </w:p>
+    <w:p>
+      <w:pPr>
+        <w:pStyle w:val="ListBullet"/>
+        <w:spacing w:after="60"/>
+        <w:ind w:left="720"/>
+      </w:pPr>
+      <w:r>
+        <w:t>HTTP — TCP — port 80  (Add rule → Application: HTTP)</w:t>
+      </w:r>
+    </w:p>
+    <w:p>
+      <w:pPr>
+        <w:pStyle w:val="ListBullet"/>
+        <w:spacing w:after="60"/>
+        <w:ind w:left="720"/>
+      </w:pPr>
+      <w:r>
+        <w:t>HTTPS — TCP — port 443  (Add rule → Application: HTTPS)</w:t>
+      </w:r>
+    </w:p>
+    <w:p>
+      <w:pPr>
+        <w:spacing w:after="120"/>
+        <w:shd w:val="clear" w:color="auto" w:fill="EAF2FB"/>
+        <w:pBdr>
+          <w:top w:val="single" w:sz="6" w:space="6" w:color="BBD4EE"/>
+          <w:left w:val="single" w:sz="6" w:space="6" w:color="BBD4EE"/>
+          <w:bottom w:val="single" w:sz="6" w:space="6" w:color="BBD4EE"/>
+          <w:right w:val="single" w:sz="6" w:space="6" w:color="BBD4EE"/>
+        </w:pBdr>
+      </w:pPr>
+      <w:r>
+        <w:rPr>
+          <w:b/>
+          <w:sz w:val="20"/>
+        </w:rPr>
+        <w:t xml:space="preserve">On screen: </w:t>
+      </w:r>
+      <w:r>
+        <w:rPr>
+          <w:sz w:val="20"/>
+        </w:rPr>
+        <w:t>The IPv4 Firewall table listing SSH (22), HTTP (80), and HTTPS (443).</w:t>
+      </w:r>
+    </w:p>
+    <w:p>
+      <w:pPr>
+        <w:pBdr>
+          <w:bottom w:val="single" w:sz="6" w:space="1" w:color="BBBBBB"/>
+        </w:pBdr>
+      </w:pPr>
+    </w:p>
+    <w:p>
+      <w:pPr>
+        <w:pStyle w:val="Heading1"/>
+      </w:pPr>
+      <w:r>
+        <w:t>Part 7 · Connect to the server and install software</w:t>
+      </w:r>
+    </w:p>
+    <w:p>
+      <w:pPr>
+        <w:spacing w:after="120"/>
       </w:pPr>
       <w:r>
         <w:rPr>
@@ -1892,7 +2593,90 @@
           <w:i w:val="0"/>
           <w:sz w:val="22"/>
         </w:rPr>
-        <w:t>Type each block below and press Enter. Wait for each to finish.</w:t>
+        <w:t>You’ll type commands into the server. No SSH setup is needed — Lightsail gives you a terminal in the browser.</w:t>
+      </w:r>
+    </w:p>
+    <w:p>
+      <w:pPr>
+        <w:pStyle w:val="ListNumber"/>
+        <w:spacing w:after="60"/>
+      </w:pPr>
+      <w:r>
+        <w:t>On the Lightsail home page, click the isp-web instance to open it (the Connect tab is shown by default).</w:t>
+      </w:r>
+    </w:p>
+    <w:p>
+      <w:pPr>
+        <w:pStyle w:val="ListNumber"/>
+        <w:spacing w:after="60"/>
+      </w:pPr>
+      <w:r>
+        <w:rPr>
+          <w:b w:val="0"/>
+        </w:rPr>
+        <w:t xml:space="preserve">Click the orange </w:t>
+      </w:r>
+      <w:r>
+        <w:rPr>
+          <w:b/>
+        </w:rPr>
+        <w:t>Connect using SSH</w:t>
+      </w:r>
+      <w:r>
+        <w:rPr>
+          <w:b w:val="0"/>
+        </w:rPr>
+        <w:t xml:space="preserve"> button. A black terminal window opens in a pop-up.</w:t>
+      </w:r>
+    </w:p>
+    <w:p>
+      <w:pPr>
+        <w:spacing w:after="120"/>
+        <w:shd w:val="clear" w:color="auto" w:fill="EAF2FB"/>
+        <w:pBdr>
+          <w:top w:val="single" w:sz="6" w:space="6" w:color="BBD4EE"/>
+          <w:left w:val="single" w:sz="6" w:space="6" w:color="BBD4EE"/>
+          <w:bottom w:val="single" w:sz="6" w:space="6" w:color="BBD4EE"/>
+          <w:right w:val="single" w:sz="6" w:space="6" w:color="BBD4EE"/>
+        </w:pBdr>
+      </w:pPr>
+      <w:r>
+        <w:rPr>
+          <w:b/>
+          <w:sz w:val="20"/>
+        </w:rPr>
+        <w:t xml:space="preserve">On screen: </w:t>
+      </w:r>
+      <w:r>
+        <w:rPr>
+          <w:sz w:val="20"/>
+        </w:rPr>
+        <w:t>A terminal ending in a prompt like  ubuntu@ip-172-26-x-x:~$  and a blinking cursor.</w:t>
+      </w:r>
+    </w:p>
+    <w:p>
+      <w:pPr>
+        <w:spacing w:after="160"/>
+        <w:shd w:val="clear" w:color="auto" w:fill="FFF6E5"/>
+        <w:pBdr>
+          <w:top w:val="single" w:sz="6" w:space="6" w:color="D0D0D0"/>
+          <w:left w:val="single" w:sz="6" w:space="6" w:color="D0D0D0"/>
+          <w:bottom w:val="single" w:sz="6" w:space="6" w:color="D0D0D0"/>
+          <w:right w:val="single" w:sz="6" w:space="6" w:color="D0D0D0"/>
+        </w:pBdr>
+      </w:pPr>
+      <w:r>
+        <w:rPr>
+          <w:b/>
+          <w:sz w:val="21"/>
+        </w:rPr>
+        <w:t xml:space="preserve">Note: </w:t>
+      </w:r>
+      <w:r>
+        <w:rPr>
+          <w:sz w:val="21"/>
+        </w:rPr>
+        <w:t>How to run a command: click into the black window, paste a block below (Ctrl+V, or right-click → Paste), and press Enter. Wait until the prompt (ubuntu@…:~$) returns before pasting the next block. Lines starting with # are comments — they’re fine to paste.</w:t>
       </w:r>
     </w:p>
     <w:p>
@@ -1905,7 +2689,7 @@
           <w:i w:val="0"/>
           <w:sz w:val="22"/>
         </w:rPr>
-        <w:t>Update the server and install base tools:</w:t>
+        <w:t>Update the server and install base tools. build-essential provides the C/C++ compiler the database driver (better-sqlite3) needs to build — without it, npm ci in Part 8 fails with “not found: make”:</w:t>
       </w:r>
     </w:p>
     <w:p>
@@ -1932,7 +2716,7 @@
           <w:rFonts w:ascii="Consolas" w:hAnsi="Consolas"/>
           <w:sz w:val="19"/>
         </w:rPr>
-        <w:t>sudo apt -y install git nginx sqlite3 curl</w:t>
+        <w:t>sudo apt -y install git nginx sqlite3 curl build-essential</w:t>
       </w:r>
     </w:p>
     <w:p>
@@ -2074,39 +2858,44 @@
     </w:p>
     <w:p>
       <w:pPr>
-        <w:pBdr>
-          <w:bottom w:val="single" w:sz="6" w:space="1" w:color="BBBBBB"/>
-        </w:pBdr>
-      </w:pPr>
+        <w:pStyle w:val="Heading2"/>
+      </w:pPr>
+      <w:r>
+        <w:t>7a. Add swap space (REQUIRED on a 1 GB server)</w:t>
+      </w:r>
     </w:p>
     <w:p>
       <w:pPr>
-        <w:pStyle w:val="Heading1"/>
-      </w:pPr>
-      <w:r>
-        <w:t>Part 8 · Install and run the website</w:t>
+        <w:spacing w:after="160"/>
+        <w:shd w:val="clear" w:color="auto" w:fill="FDECEA"/>
+        <w:pBdr>
+          <w:top w:val="single" w:sz="6" w:space="6" w:color="D0D0D0"/>
+          <w:left w:val="single" w:sz="6" w:space="6" w:color="D0D0D0"/>
+          <w:bottom w:val="single" w:sz="6" w:space="6" w:color="D0D0D0"/>
+          <w:right w:val="single" w:sz="6" w:space="6" w:color="D0D0D0"/>
+        </w:pBdr>
+      </w:pPr>
+      <w:r>
+        <w:rPr>
+          <w:b/>
+          <w:sz w:val="21"/>
+        </w:rPr>
+        <w:t xml:space="preserve">IMPORTANT: </w:t>
+      </w:r>
+      <w:r>
+        <w:rPr>
+          <w:sz w:val="21"/>
+        </w:rPr>
+        <w:t>A 1 GB server does not have enough memory to build a Next.js app. Without the two fixes below, the build in Part 8 fails — either with “Killed” (out of system memory) or “JavaScript heap out of memory” (Node's heap ceiling is too low). Adding swap + raising Node's heap fixes both. Do this once, now.</w:t>
       </w:r>
     </w:p>
     <w:p>
       <w:pPr>
-        <w:spacing w:after="120"/>
-      </w:pPr>
-      <w:r>
-        <w:rPr>
-          <w:b w:val="0"/>
-          <w:i w:val="0"/>
-          <w:sz w:val="22"/>
-        </w:rPr>
-        <w:t>This is the “build and start the app” step. Still in the SSH terminal:</w:t>
-      </w:r>
-    </w:p>
-    <w:p>
-      <w:pPr>
         <w:pStyle w:val="ListNumber"/>
         <w:spacing w:after="60"/>
       </w:pPr>
       <w:r>
-        <w:t>Download the code:</w:t>
+        <w:t>Create and enable a 4 GB swap file (run each line; they finish instantly):</w:t>
       </w:r>
     </w:p>
     <w:p>
@@ -2125,7 +2914,7 @@
           <w:rFonts w:ascii="Consolas" w:hAnsi="Consolas"/>
           <w:sz w:val="19"/>
         </w:rPr>
-        <w:t>cd /home/ubuntu</w:t>
+        <w:t>sudo fallocate -l 4G /swapfile</w:t>
         <w:br/>
       </w:r>
       <w:r>
@@ -2133,7 +2922,7 @@
           <w:rFonts w:ascii="Consolas" w:hAnsi="Consolas"/>
           <w:sz w:val="19"/>
         </w:rPr>
-        <w:t>git clone https://github.com/ISPCODER/ISP.git</w:t>
+        <w:t>sudo chmod 600 /swapfile</w:t>
         <w:br/>
       </w:r>
       <w:r>
@@ -2141,7 +2930,23 @@
           <w:rFonts w:ascii="Consolas" w:hAnsi="Consolas"/>
           <w:sz w:val="19"/>
         </w:rPr>
-        <w:t>cd ISP/website</w:t>
+        <w:t>sudo mkswap /swapfile</w:t>
+        <w:br/>
+      </w:r>
+      <w:r>
+        <w:rPr>
+          <w:rFonts w:ascii="Consolas" w:hAnsi="Consolas"/>
+          <w:sz w:val="19"/>
+        </w:rPr>
+        <w:t>sudo swapon /swapfile</w:t>
+        <w:br/>
+      </w:r>
+      <w:r>
+        <w:rPr>
+          <w:rFonts w:ascii="Consolas" w:hAnsi="Consolas"/>
+          <w:sz w:val="19"/>
+        </w:rPr>
+        <w:t>echo '/swapfile none swap sw 0 0' | sudo tee -a /etc/fstab</w:t>
       </w:r>
     </w:p>
     <w:p>
@@ -2150,7 +2955,7 @@
         <w:spacing w:after="60"/>
       </w:pPr>
       <w:r>
-        <w:t>Create the folder for the database file:</w:t>
+        <w:t>Confirm it worked:</w:t>
       </w:r>
     </w:p>
     <w:p>
@@ -2169,16 +2974,41 @@
           <w:rFonts w:ascii="Consolas" w:hAnsi="Consolas"/>
           <w:sz w:val="19"/>
         </w:rPr>
-        <w:t>mkdir -p /home/ubuntu/data</w:t>
+        <w:t>free -h</w:t>
       </w:r>
     </w:p>
     <w:p>
       <w:pPr>
+        <w:spacing w:after="120"/>
+        <w:shd w:val="clear" w:color="auto" w:fill="EAF2FB"/>
+        <w:pBdr>
+          <w:top w:val="single" w:sz="6" w:space="6" w:color="BBD4EE"/>
+          <w:left w:val="single" w:sz="6" w:space="6" w:color="BBD4EE"/>
+          <w:bottom w:val="single" w:sz="6" w:space="6" w:color="BBD4EE"/>
+          <w:right w:val="single" w:sz="6" w:space="6" w:color="BBD4EE"/>
+        </w:pBdr>
+      </w:pPr>
+      <w:r>
+        <w:rPr>
+          <w:b/>
+          <w:sz w:val="20"/>
+        </w:rPr>
+        <w:t xml:space="preserve">On screen: </w:t>
+      </w:r>
+      <w:r>
+        <w:rPr>
+          <w:sz w:val="20"/>
+        </w:rPr>
+        <w:t>A table with a “Swap:” row showing about 4.0Gi total. (The last command above makes the swap survive reboots.)</w:t>
+      </w:r>
+    </w:p>
+    <w:p>
+      <w:pPr>
         <w:pStyle w:val="ListNumber"/>
         <w:spacing w:after="60"/>
       </w:pPr>
       <w:r>
-        <w:t>Generate a login-security secret and copy the output:</w:t>
+        <w:t>Also raise Node’s memory ceiling for every future build (the build type-checks with a low default heap and will fail with “JavaScript heap out of memory” otherwise):</w:t>
       </w:r>
     </w:p>
     <w:p>
@@ -2197,7 +3027,87 @@
           <w:rFonts w:ascii="Consolas" w:hAnsi="Consolas"/>
           <w:sz w:val="19"/>
         </w:rPr>
-        <w:t>npx auth secret</w:t>
+        <w:t>echo 'export NODE_OPTIONS=--max-old-space-size=2048' &gt;&gt; ~/.bashrc</w:t>
+        <w:br/>
+      </w:r>
+      <w:r>
+        <w:rPr>
+          <w:rFonts w:ascii="Consolas" w:hAnsi="Consolas"/>
+          <w:sz w:val="19"/>
+        </w:rPr>
+        <w:t>source ~/.bashrc</w:t>
+      </w:r>
+    </w:p>
+    <w:p>
+      <w:pPr>
+        <w:pBdr>
+          <w:bottom w:val="single" w:sz="6" w:space="1" w:color="BBBBBB"/>
+        </w:pBdr>
+      </w:pPr>
+    </w:p>
+    <w:p>
+      <w:pPr>
+        <w:pStyle w:val="Heading1"/>
+      </w:pPr>
+      <w:r>
+        <w:t>Part 8 · Install and run the website</w:t>
+      </w:r>
+    </w:p>
+    <w:p>
+      <w:pPr>
+        <w:spacing w:after="120"/>
+      </w:pPr>
+      <w:r>
+        <w:rPr>
+          <w:b w:val="0"/>
+          <w:i w:val="0"/>
+          <w:sz w:val="22"/>
+        </w:rPr>
+        <w:t>This is the Node.js equivalent of “build the app and start it.” Do everything in the SSH terminal from Part 7. Paste one block, wait for the prompt to return, then paste the next.</w:t>
+      </w:r>
+    </w:p>
+    <w:p>
+      <w:pPr>
+        <w:pStyle w:val="ListNumber"/>
+        <w:spacing w:after="60"/>
+      </w:pPr>
+      <w:r>
+        <w:t>Download the code (the app lives in the website/ subfolder of the repo):</w:t>
+      </w:r>
+    </w:p>
+    <w:p>
+      <w:pPr>
+        <w:spacing w:after="160" w:before="80"/>
+        <w:shd w:val="clear" w:color="auto" w:fill="F2F3F5"/>
+        <w:pBdr>
+          <w:top w:val="single" w:sz="6" w:space="6" w:color="D0D0D0"/>
+          <w:left w:val="single" w:sz="6" w:space="6" w:color="D0D0D0"/>
+          <w:bottom w:val="single" w:sz="6" w:space="6" w:color="D0D0D0"/>
+          <w:right w:val="single" w:sz="6" w:space="6" w:color="D0D0D0"/>
+        </w:pBdr>
+      </w:pPr>
+      <w:r>
+        <w:rPr>
+          <w:rFonts w:ascii="Consolas" w:hAnsi="Consolas"/>
+          <w:sz w:val="19"/>
+        </w:rPr>
+        <w:t>cd /home/ubuntu</w:t>
+        <w:br/>
+      </w:r>
+      <w:r>
+        <w:rPr>
+          <w:rFonts w:ascii="Consolas" w:hAnsi="Consolas"/>
+          <w:sz w:val="19"/>
+        </w:rPr>
+        <w:t>git clone https://github.com/APEXBOTCODER/ISPPROJECT.git</w:t>
+        <w:br/>
+      </w:r>
+      <w:r>
+        <w:rPr>
+          <w:rFonts w:ascii="Consolas" w:hAnsi="Consolas"/>
+          <w:sz w:val="19"/>
+        </w:rPr>
+        <w:t>cd ISPPROJECT/website</w:t>
       </w:r>
     </w:p>
     <w:p>
@@ -2222,7 +3132,7 @@
         <w:rPr>
           <w:sz w:val="20"/>
         </w:rPr>
-        <w:t>A long random string. Copy it — you’ll paste it as AUTH_SECRET next.</w:t>
+        <w:t>Git prints “Cloning into 'ISPPROJECT'…” and a progress line, then the prompt returns.</w:t>
       </w:r>
     </w:p>
     <w:p>
@@ -2231,7 +3141,7 @@
         <w:spacing w:after="60"/>
       </w:pPr>
       <w:r>
-        <w:t>Create the settings file. This opens a simple text editor (nano):</w:t>
+        <w:t>Create the folder that will hold the database file:</w:t>
       </w:r>
     </w:p>
     <w:p>
@@ -2250,7 +3160,7 @@
           <w:rFonts w:ascii="Consolas" w:hAnsi="Consolas"/>
           <w:sz w:val="19"/>
         </w:rPr>
-        <w:t>nano .env</w:t>
+        <w:t>mkdir -p /home/ubuntu/data</w:t>
       </w:r>
     </w:p>
     <w:p>
@@ -2259,7 +3169,7 @@
         <w:spacing w:after="60"/>
       </w:pPr>
       <w:r>
-        <w:t>Paste the block below. Replace the ALL-CAPS placeholders with your real values (keys from Part 3, secret from step 3 above):</w:t>
+        <w:t>Generate a login-security secret (this prints a random string):</w:t>
       </w:r>
     </w:p>
     <w:p>
@@ -2278,105 +3188,58 @@
           <w:rFonts w:ascii="Consolas" w:hAnsi="Consolas"/>
           <w:sz w:val="19"/>
         </w:rPr>
-        <w:t>DATABASE_URL=file:/home/ubuntu/data/prod.db</w:t>
-        <w:br/>
-      </w:r>
-      <w:r>
-        <w:rPr>
-          <w:rFonts w:ascii="Consolas" w:hAnsi="Consolas"/>
-          <w:sz w:val="19"/>
-        </w:rPr>
-        <w:t>AUTH_SECRET=PASTE_THE_SECRET_FROM_ABOVE</w:t>
-        <w:br/>
-      </w:r>
-      <w:r>
-        <w:rPr>
-          <w:rFonts w:ascii="Consolas" w:hAnsi="Consolas"/>
-          <w:sz w:val="19"/>
-        </w:rPr>
-        <w:t>AUTH_TRUST_HOST=true</w:t>
-        <w:br/>
-      </w:r>
-      <w:r>
-        <w:rPr>
-          <w:rFonts w:ascii="Consolas" w:hAnsi="Consolas"/>
-          <w:sz w:val="19"/>
-        </w:rPr>
-        <w:t>NEXT_PUBLIC_SITE_URL=https://infinitysportspark.com</w:t>
-        <w:br/>
-      </w:r>
-      <w:r>
-        <w:rPr>
-          <w:rFonts w:ascii="Consolas" w:hAnsi="Consolas"/>
-          <w:sz w:val="19"/>
-        </w:rPr>
-        <w:t>EMAIL_PROVIDER=ses</w:t>
-        <w:br/>
-      </w:r>
-      <w:r>
-        <w:rPr>
-          <w:rFonts w:ascii="Consolas" w:hAnsi="Consolas"/>
-          <w:sz w:val="19"/>
-        </w:rPr>
-        <w:t>EMAIL_FROM=Infinity Sports Park &lt;no-reply@infinitysportspark.com&gt;</w:t>
-        <w:br/>
-      </w:r>
-      <w:r>
-        <w:rPr>
-          <w:rFonts w:ascii="Consolas" w:hAnsi="Consolas"/>
-          <w:sz w:val="19"/>
-        </w:rPr>
-        <w:t>SMS_PROVIDER=console</w:t>
-        <w:br/>
-      </w:r>
-      <w:r>
-        <w:rPr>
-          <w:rFonts w:ascii="Consolas" w:hAnsi="Consolas"/>
-          <w:sz w:val="19"/>
-        </w:rPr>
-        <w:t>AWS_REGION=us-east-1</w:t>
-        <w:br/>
-      </w:r>
-      <w:r>
-        <w:rPr>
-          <w:rFonts w:ascii="Consolas" w:hAnsi="Consolas"/>
-          <w:sz w:val="19"/>
-        </w:rPr>
-        <w:t>AWS_ACCESS_KEY_ID=PASTE_ACCESS_KEY_ID</w:t>
-        <w:br/>
-      </w:r>
-      <w:r>
-        <w:rPr>
-          <w:rFonts w:ascii="Consolas" w:hAnsi="Consolas"/>
-          <w:sz w:val="19"/>
-        </w:rPr>
-        <w:t>AWS_SECRET_ACCESS_KEY=PASTE_SECRET_ACCESS_KEY</w:t>
-        <w:br/>
-      </w:r>
-      <w:r>
-        <w:rPr>
-          <w:rFonts w:ascii="Consolas" w:hAnsi="Consolas"/>
-          <w:sz w:val="19"/>
-        </w:rPr>
-        <w:t>LEGAL_REVIEWED=false</w:t>
+        <w:t>openssl rand -base64 33</w:t>
       </w:r>
     </w:p>
     <w:p>
       <w:pPr>
+        <w:spacing w:after="120"/>
+        <w:shd w:val="clear" w:color="auto" w:fill="EAF2FB"/>
+        <w:pBdr>
+          <w:top w:val="single" w:sz="6" w:space="6" w:color="BBD4EE"/>
+          <w:left w:val="single" w:sz="6" w:space="6" w:color="BBD4EE"/>
+          <w:bottom w:val="single" w:sz="6" w:space="6" w:color="BBD4EE"/>
+          <w:right w:val="single" w:sz="6" w:space="6" w:color="BBD4EE"/>
+        </w:pBdr>
+      </w:pPr>
+      <w:r>
+        <w:rPr>
+          <w:b/>
+          <w:sz w:val="20"/>
+        </w:rPr>
+        <w:t xml:space="preserve">On screen: </w:t>
+      </w:r>
+      <w:r>
+        <w:rPr>
+          <w:sz w:val="20"/>
+        </w:rPr>
+        <w:t>A ~44-character random string. Select it and copy it — you paste it as AUTH_SECRET next.</w:t>
+      </w:r>
+    </w:p>
+    <w:p>
+      <w:pPr>
+        <w:spacing w:after="120"/>
+      </w:pPr>
+      <w:r>
+        <w:rPr>
+          <w:b w:val="0"/>
+          <w:i/>
+          <w:color w:val="555555"/>
+          <w:sz w:val="22"/>
+        </w:rPr>
+        <w:t>(Use this instead of “npx auth secret,” which downloads a package and can run out of memory on a small server.)</w:t>
+      </w:r>
+    </w:p>
+    <w:p>
+      <w:pPr>
         <w:pStyle w:val="ListNumber"/>
         <w:spacing w:after="60"/>
       </w:pPr>
       <w:r>
-        <w:t>Save and close nano: press Ctrl+O, then Enter, then Ctrl+X.</w:t>
-      </w:r>
-    </w:p>
-    <w:p>
-      <w:pPr>
-        <w:pStyle w:val="ListNumber"/>
-        <w:spacing w:after="60"/>
-      </w:pPr>
-      <w:r>
-        <w:t>Install, build, and create the database:</w:t>
+        <w:rPr>
+          <w:b w:val="0"/>
+        </w:rPr>
+        <w:t>Open a simple text editor to create the settings file:</w:t>
       </w:r>
     </w:p>
     <w:p>
@@ -2395,40 +3258,41 @@
           <w:rFonts w:ascii="Consolas" w:hAnsi="Consolas"/>
           <w:sz w:val="19"/>
         </w:rPr>
-        <w:t>npm ci</w:t>
-        <w:br/>
-      </w:r>
-      <w:r>
-        <w:rPr>
-          <w:rFonts w:ascii="Consolas" w:hAnsi="Consolas"/>
-          <w:sz w:val="19"/>
-        </w:rPr>
-        <w:t>npx prisma generate</w:t>
-        <w:br/>
-      </w:r>
-      <w:r>
-        <w:rPr>
-          <w:rFonts w:ascii="Consolas" w:hAnsi="Consolas"/>
-          <w:sz w:val="19"/>
-        </w:rPr>
-        <w:t>npm run build</w:t>
-        <w:br/>
-      </w:r>
-      <w:r>
-        <w:rPr>
-          <w:rFonts w:ascii="Consolas" w:hAnsi="Consolas"/>
-          <w:sz w:val="19"/>
-        </w:rPr>
-        <w:t>npx prisma migrate deploy</w:t>
+        <w:t>nano .env</w:t>
       </w:r>
     </w:p>
     <w:p>
       <w:pPr>
+        <w:spacing w:after="120"/>
+        <w:shd w:val="clear" w:color="auto" w:fill="EAF2FB"/>
+        <w:pBdr>
+          <w:top w:val="single" w:sz="6" w:space="6" w:color="BBD4EE"/>
+          <w:left w:val="single" w:sz="6" w:space="6" w:color="BBD4EE"/>
+          <w:bottom w:val="single" w:sz="6" w:space="6" w:color="BBD4EE"/>
+          <w:right w:val="single" w:sz="6" w:space="6" w:color="BBD4EE"/>
+        </w:pBdr>
+      </w:pPr>
+      <w:r>
+        <w:rPr>
+          <w:b/>
+          <w:sz w:val="20"/>
+        </w:rPr>
+        <w:t xml:space="preserve">On screen: </w:t>
+      </w:r>
+      <w:r>
+        <w:rPr>
+          <w:sz w:val="20"/>
+        </w:rPr>
+        <w:t>An empty editor fills the terminal, with a menu of ^ shortcuts along the bottom (^ means the Ctrl key).</w:t>
+      </w:r>
+    </w:p>
+    <w:p>
+      <w:pPr>
         <w:pStyle w:val="ListNumber"/>
         <w:spacing w:after="60"/>
       </w:pPr>
       <w:r>
-        <w:t>Load the starting data (facilities, pricing, admin login, waiver). Run this ONCE:</w:t>
+        <w:t>Paste the block below, then replace each ALL-CAPS placeholder with your real value (AWS keys from Part 3c; the secret you just copied):</w:t>
       </w:r>
     </w:p>
     <w:p>
@@ -2447,7 +3311,175 @@
           <w:rFonts w:ascii="Consolas" w:hAnsi="Consolas"/>
           <w:sz w:val="19"/>
         </w:rPr>
-        <w:t>npm run db:seed</w:t>
+        <w:t>DATABASE_URL=file:/home/ubuntu/data/prod.db</w:t>
+        <w:br/>
+      </w:r>
+      <w:r>
+        <w:rPr>
+          <w:rFonts w:ascii="Consolas" w:hAnsi="Consolas"/>
+          <w:sz w:val="19"/>
+        </w:rPr>
+        <w:t>AUTH_SECRET=PASTE_THE_SECRET_FROM_ABOVE</w:t>
+        <w:br/>
+      </w:r>
+      <w:r>
+        <w:rPr>
+          <w:rFonts w:ascii="Consolas" w:hAnsi="Consolas"/>
+          <w:sz w:val="19"/>
+        </w:rPr>
+        <w:t>AUTH_TRUST_HOST=true</w:t>
+        <w:br/>
+      </w:r>
+      <w:r>
+        <w:rPr>
+          <w:rFonts w:ascii="Consolas" w:hAnsi="Consolas"/>
+          <w:sz w:val="19"/>
+        </w:rPr>
+        <w:t>NEXT_PUBLIC_SITE_URL=https://infinitysportspark.com</w:t>
+        <w:br/>
+      </w:r>
+      <w:r>
+        <w:rPr>
+          <w:rFonts w:ascii="Consolas" w:hAnsi="Consolas"/>
+          <w:sz w:val="19"/>
+        </w:rPr>
+        <w:t>EMAIL_PROVIDER=ses</w:t>
+        <w:br/>
+      </w:r>
+      <w:r>
+        <w:rPr>
+          <w:rFonts w:ascii="Consolas" w:hAnsi="Consolas"/>
+          <w:sz w:val="19"/>
+        </w:rPr>
+        <w:t>EMAIL_FROM=Infinity Sports Park &lt;no-reply@infinitysportspark.com&gt;</w:t>
+        <w:br/>
+      </w:r>
+      <w:r>
+        <w:rPr>
+          <w:rFonts w:ascii="Consolas" w:hAnsi="Consolas"/>
+          <w:sz w:val="19"/>
+        </w:rPr>
+        <w:t>SMS_PROVIDER=console</w:t>
+        <w:br/>
+      </w:r>
+      <w:r>
+        <w:rPr>
+          <w:rFonts w:ascii="Consolas" w:hAnsi="Consolas"/>
+          <w:sz w:val="19"/>
+        </w:rPr>
+        <w:t>AWS_REGION=us-east-1</w:t>
+        <w:br/>
+      </w:r>
+      <w:r>
+        <w:rPr>
+          <w:rFonts w:ascii="Consolas" w:hAnsi="Consolas"/>
+          <w:sz w:val="19"/>
+        </w:rPr>
+        <w:t>AWS_ACCESS_KEY_ID=PASTE_ACCESS_KEY_ID</w:t>
+        <w:br/>
+      </w:r>
+      <w:r>
+        <w:rPr>
+          <w:rFonts w:ascii="Consolas" w:hAnsi="Consolas"/>
+          <w:sz w:val="19"/>
+        </w:rPr>
+        <w:t>AWS_SECRET_ACCESS_KEY=PASTE_SECRET_ACCESS_KEY</w:t>
+        <w:br/>
+      </w:r>
+      <w:r>
+        <w:rPr>
+          <w:rFonts w:ascii="Consolas" w:hAnsi="Consolas"/>
+          <w:sz w:val="19"/>
+        </w:rPr>
+        <w:t>LEGAL_REVIEWED=false</w:t>
+      </w:r>
+    </w:p>
+    <w:p>
+      <w:pPr>
+        <w:pStyle w:val="ListNumber"/>
+        <w:spacing w:after="60"/>
+      </w:pPr>
+      <w:r>
+        <w:rPr>
+          <w:b w:val="0"/>
+        </w:rPr>
+        <w:t xml:space="preserve">Save and close the editor: press </w:t>
+      </w:r>
+      <w:r>
+        <w:rPr>
+          <w:b/>
+        </w:rPr>
+        <w:t>Ctrl+O</w:t>
+      </w:r>
+      <w:r>
+        <w:rPr>
+          <w:b w:val="0"/>
+        </w:rPr>
+        <w:t xml:space="preserve"> (the O key), then Enter to confirm the filename, then </w:t>
+      </w:r>
+      <w:r>
+        <w:rPr>
+          <w:b/>
+        </w:rPr>
+        <w:t>Ctrl+X</w:t>
+      </w:r>
+      <w:r>
+        <w:rPr>
+          <w:b w:val="0"/>
+        </w:rPr>
+        <w:t xml:space="preserve"> to exit. You’re back at the prompt.</w:t>
+      </w:r>
+    </w:p>
+    <w:p>
+      <w:pPr>
+        <w:pStyle w:val="ListNumber"/>
+        <w:spacing w:after="60"/>
+      </w:pPr>
+      <w:r>
+        <w:t>Install dependencies, build the app, and create the database tables (this takes a few minutes):</w:t>
+      </w:r>
+    </w:p>
+    <w:p>
+      <w:pPr>
+        <w:spacing w:after="160" w:before="80"/>
+        <w:shd w:val="clear" w:color="auto" w:fill="F2F3F5"/>
+        <w:pBdr>
+          <w:top w:val="single" w:sz="6" w:space="6" w:color="D0D0D0"/>
+          <w:left w:val="single" w:sz="6" w:space="6" w:color="D0D0D0"/>
+          <w:bottom w:val="single" w:sz="6" w:space="6" w:color="D0D0D0"/>
+          <w:right w:val="single" w:sz="6" w:space="6" w:color="D0D0D0"/>
+        </w:pBdr>
+      </w:pPr>
+      <w:r>
+        <w:rPr>
+          <w:rFonts w:ascii="Consolas" w:hAnsi="Consolas"/>
+          <w:sz w:val="19"/>
+        </w:rPr>
+        <w:t>npm ci</w:t>
+        <w:br/>
+      </w:r>
+      <w:r>
+        <w:rPr>
+          <w:rFonts w:ascii="Consolas" w:hAnsi="Consolas"/>
+          <w:sz w:val="19"/>
+        </w:rPr>
+        <w:t>npx prisma generate</w:t>
+        <w:br/>
+      </w:r>
+      <w:r>
+        <w:rPr>
+          <w:rFonts w:ascii="Consolas" w:hAnsi="Consolas"/>
+          <w:sz w:val="19"/>
+        </w:rPr>
+        <w:t>npm run build</w:t>
+        <w:br/>
+      </w:r>
+      <w:r>
+        <w:rPr>
+          <w:rFonts w:ascii="Consolas" w:hAnsi="Consolas"/>
+          <w:sz w:val="19"/>
+        </w:rPr>
+        <w:t>npx prisma migrate deploy</w:t>
       </w:r>
     </w:p>
     <w:p>
@@ -2472,7 +3504,7 @@
         <w:rPr>
           <w:sz w:val="20"/>
         </w:rPr>
-        <w:t>It prints an Admin login and a Customer login — save these; change the passwords after launch.</w:t>
+        <w:t>Lots of progress text; it ends with the prompt returning and no red “error” lines.</w:t>
       </w:r>
     </w:p>
     <w:p>
@@ -2481,7 +3513,7 @@
         <w:spacing w:after="60"/>
       </w:pPr>
       <w:r>
-        <w:t>Start the website and make it auto-start on reboot:</w:t>
+        <w:t>Load the starting data — facilities, pricing, an admin login, and the waiver. Run this ONCE only:</w:t>
       </w:r>
     </w:p>
     <w:p>
@@ -2500,41 +3532,41 @@
           <w:rFonts w:ascii="Consolas" w:hAnsi="Consolas"/>
           <w:sz w:val="19"/>
         </w:rPr>
-        <w:t>pm2 start "npm run start" --name isp</w:t>
-        <w:br/>
-      </w:r>
-      <w:r>
-        <w:rPr>
-          <w:rFonts w:ascii="Consolas" w:hAnsi="Consolas"/>
-          <w:sz w:val="19"/>
-        </w:rPr>
-        <w:t>pm2 save</w:t>
-        <w:br/>
-      </w:r>
-      <w:r>
-        <w:rPr>
-          <w:rFonts w:ascii="Consolas" w:hAnsi="Consolas"/>
-          <w:sz w:val="19"/>
-        </w:rPr>
-        <w:t>pm2 startup systemd</w:t>
+        <w:t>npm run db:seed</w:t>
       </w:r>
     </w:p>
     <w:p>
       <w:pPr>
+        <w:spacing w:after="120"/>
+        <w:shd w:val="clear" w:color="auto" w:fill="EAF2FB"/>
+        <w:pBdr>
+          <w:top w:val="single" w:sz="6" w:space="6" w:color="BBD4EE"/>
+          <w:left w:val="single" w:sz="6" w:space="6" w:color="BBD4EE"/>
+          <w:bottom w:val="single" w:sz="6" w:space="6" w:color="BBD4EE"/>
+          <w:right w:val="single" w:sz="6" w:space="6" w:color="BBD4EE"/>
+        </w:pBdr>
+      </w:pPr>
+      <w:r>
+        <w:rPr>
+          <w:b/>
+          <w:sz w:val="20"/>
+        </w:rPr>
+        <w:t xml:space="preserve">On screen: </w:t>
+      </w:r>
+      <w:r>
+        <w:rPr>
+          <w:sz w:val="20"/>
+        </w:rPr>
+        <w:t>It prints an Admin login and a Customer login (email + password). Copy them somewhere safe; change the passwords after launch.</w:t>
+      </w:r>
+    </w:p>
+    <w:p>
+      <w:pPr>
         <w:pStyle w:val="ListNumber"/>
         <w:spacing w:after="60"/>
       </w:pPr>
       <w:r>
-        <w:t>It prints one line beginning with sudo — copy that whole line, paste it, press Enter.</w:t>
-      </w:r>
-    </w:p>
-    <w:p>
-      <w:pPr>
-        <w:pStyle w:val="ListNumber"/>
-        <w:spacing w:after="60"/>
-      </w:pPr>
-      <w:r>
-        <w:t>Check the site is running:</w:t>
+        <w:t>Start the website and make it restart automatically on reboot or crash:</w:t>
       </w:r>
     </w:p>
     <w:p>
@@ -2553,6 +3585,76 @@
           <w:rFonts w:ascii="Consolas" w:hAnsi="Consolas"/>
           <w:sz w:val="19"/>
         </w:rPr>
+        <w:t>pm2 start "npm run start" --name isp</w:t>
+        <w:br/>
+      </w:r>
+      <w:r>
+        <w:rPr>
+          <w:rFonts w:ascii="Consolas" w:hAnsi="Consolas"/>
+          <w:sz w:val="19"/>
+        </w:rPr>
+        <w:t>pm2 save</w:t>
+        <w:br/>
+      </w:r>
+      <w:r>
+        <w:rPr>
+          <w:rFonts w:ascii="Consolas" w:hAnsi="Consolas"/>
+          <w:sz w:val="19"/>
+        </w:rPr>
+        <w:t>pm2 startup systemd</w:t>
+      </w:r>
+    </w:p>
+    <w:p>
+      <w:pPr>
+        <w:pStyle w:val="ListNumber"/>
+        <w:spacing w:after="60"/>
+      </w:pPr>
+      <w:r>
+        <w:rPr>
+          <w:b w:val="0"/>
+        </w:rPr>
+        <w:t xml:space="preserve">The last command prints one line that begins with </w:t>
+      </w:r>
+      <w:r>
+        <w:rPr>
+          <w:rFonts w:ascii="Consolas" w:hAnsi="Consolas"/>
+          <w:b w:val="0"/>
+          <w:sz w:val="20"/>
+        </w:rPr>
+        <w:t>sudo env PATH=…</w:t>
+      </w:r>
+      <w:r>
+        <w:rPr>
+          <w:b w:val="0"/>
+        </w:rPr>
+        <w:t>. Copy that entire printed line, paste it, and press Enter.</w:t>
+      </w:r>
+    </w:p>
+    <w:p>
+      <w:pPr>
+        <w:pStyle w:val="ListNumber"/>
+        <w:spacing w:after="60"/>
+      </w:pPr>
+      <w:r>
+        <w:t>Check the site is actually running:</w:t>
+      </w:r>
+    </w:p>
+    <w:p>
+      <w:pPr>
+        <w:spacing w:after="160" w:before="80"/>
+        <w:shd w:val="clear" w:color="auto" w:fill="F2F3F5"/>
+        <w:pBdr>
+          <w:top w:val="single" w:sz="6" w:space="6" w:color="D0D0D0"/>
+          <w:left w:val="single" w:sz="6" w:space="6" w:color="D0D0D0"/>
+          <w:bottom w:val="single" w:sz="6" w:space="6" w:color="D0D0D0"/>
+          <w:right w:val="single" w:sz="6" w:space="6" w:color="D0D0D0"/>
+        </w:pBdr>
+      </w:pPr>
+      <w:r>
+        <w:rPr>
+          <w:rFonts w:ascii="Consolas" w:hAnsi="Consolas"/>
+          <w:sz w:val="19"/>
+        </w:rPr>
         <w:t>curl http://localhost:3000/api/health</w:t>
       </w:r>
     </w:p>
@@ -2578,7 +3680,7 @@
         <w:rPr>
           <w:sz w:val="20"/>
         </w:rPr>
-        <w:t>The text  {"status":"ok","db":"up"}</w:t>
+        <w:t>The exact text  {"status":"ok","db":"up"}  (if you see “Connection refused,” run  pm2 logs isp  to see why).</w:t>
       </w:r>
     </w:p>
     <w:p>
@@ -2603,7 +3705,7 @@
         <w:rPr>
           <w:sz w:val="21"/>
         </w:rPr>
-        <w:t>Later, to deploy updates you pushed to GitHub: cd ISP/website &amp;&amp; git pull &amp;&amp; npm ci &amp;&amp; npx prisma migrate deploy &amp;&amp; npm run build &amp;&amp; pm2 restart isp</w:t>
+        <w:t>Deploying updates later (after you push changes to GitHub): cd /home/ubuntu/ISPPROJECT/website &amp;&amp; git pull &amp;&amp; npm ci &amp;&amp; npx prisma migrate deploy &amp;&amp; npm run build &amp;&amp; pm2 restart isp</w:t>
       </w:r>
     </w:p>
     <w:p>
@@ -2623,11 +3725,24 @@
     </w:p>
     <w:p>
       <w:pPr>
+        <w:spacing w:after="120"/>
+      </w:pPr>
+      <w:r>
+        <w:rPr>
+          <w:b w:val="0"/>
+          <w:i w:val="0"/>
+          <w:sz w:val="22"/>
+        </w:rPr>
+        <w:t>Right now the app answers only on port 3000 inside the server. Nginx sits in front on the normal web ports (80/443) and forwards traffic to it. Do this in the SSH terminal.</w:t>
+      </w:r>
+    </w:p>
+    <w:p>
+      <w:pPr>
         <w:pStyle w:val="ListNumber"/>
         <w:spacing w:after="60"/>
       </w:pPr>
       <w:r>
-        <w:t>Create the web-server config file:</w:t>
+        <w:t>Create the web-server config file (opens the nano editor):</w:t>
       </w:r>
     </w:p>
     <w:p>
@@ -2651,6 +3766,31 @@
     </w:p>
     <w:p>
       <w:pPr>
+        <w:spacing w:after="120"/>
+        <w:shd w:val="clear" w:color="auto" w:fill="EAF2FB"/>
+        <w:pBdr>
+          <w:top w:val="single" w:sz="6" w:space="6" w:color="BBD4EE"/>
+          <w:left w:val="single" w:sz="6" w:space="6" w:color="BBD4EE"/>
+          <w:bottom w:val="single" w:sz="6" w:space="6" w:color="BBD4EE"/>
+          <w:right w:val="single" w:sz="6" w:space="6" w:color="BBD4EE"/>
+        </w:pBdr>
+      </w:pPr>
+      <w:r>
+        <w:rPr>
+          <w:b/>
+          <w:sz w:val="20"/>
+        </w:rPr>
+        <w:t xml:space="preserve">On screen: </w:t>
+      </w:r>
+      <w:r>
+        <w:rPr>
+          <w:sz w:val="20"/>
+        </w:rPr>
+        <w:t>An empty nano editor.</w:t>
+      </w:r>
+    </w:p>
+    <w:p>
+      <w:pPr>
         <w:pStyle w:val="ListNumber"/>
         <w:spacing w:after="60"/>
       </w:pPr>
@@ -2779,7 +3919,7 @@
         <w:spacing w:after="60"/>
       </w:pPr>
       <w:r>
-        <w:t>Save/close (Ctrl+O, Enter, Ctrl+X). Then enable it:</w:t>
+        <w:t>Save and close (Ctrl+O, Enter, Ctrl+X). Then switch this config on and reload Nginx:</w:t>
       </w:r>
     </w:p>
     <w:p>
@@ -2820,6 +3960,31 @@
     <w:p>
       <w:pPr>
         <w:spacing w:after="120"/>
+        <w:shd w:val="clear" w:color="auto" w:fill="EAF2FB"/>
+        <w:pBdr>
+          <w:top w:val="single" w:sz="6" w:space="6" w:color="BBD4EE"/>
+          <w:left w:val="single" w:sz="6" w:space="6" w:color="BBD4EE"/>
+          <w:bottom w:val="single" w:sz="6" w:space="6" w:color="BBD4EE"/>
+          <w:right w:val="single" w:sz="6" w:space="6" w:color="BBD4EE"/>
+        </w:pBdr>
+      </w:pPr>
+      <w:r>
+        <w:rPr>
+          <w:b/>
+          <w:sz w:val="20"/>
+        </w:rPr>
+        <w:t xml:space="preserve">On screen: </w:t>
+      </w:r>
+      <w:r>
+        <w:rPr>
+          <w:sz w:val="20"/>
+        </w:rPr>
+        <w:t>nginx -t prints “syntax is ok” and “test is successful.” If it reports an error, re-open the file and check for a typo.</w:t>
+      </w:r>
+    </w:p>
+    <w:p>
+      <w:pPr>
+        <w:spacing w:after="120"/>
       </w:pPr>
       <w:r>
         <w:rPr>
@@ -2828,7 +3993,7 @@
           <w:color w:val="555555"/>
           <w:sz w:val="22"/>
         </w:rPr>
-        <w:t>HTTPS comes after DNS is pointed (Part 10). You’ll run one certbot command there.</w:t>
+        <w:t>HTTPS comes right after you point the domain (Part 10) — it’s one certbot command there.</w:t>
       </w:r>
     </w:p>
     <w:p>
@@ -2856,7 +4021,7 @@
           <w:i w:val="0"/>
           <w:sz w:val="22"/>
         </w:rPr>
-        <w:t>Do this at your domain registrar (where you bought infinitysportspark.com).</w:t>
+        <w:t>This makes infinitysportspark.com show your site. You add records at your domain registrar (the same place you added the SES DKIM records in Part 4a).</w:t>
       </w:r>
     </w:p>
     <w:p>
@@ -2865,7 +4030,7 @@
         <w:spacing w:after="60"/>
       </w:pPr>
       <w:r>
-        <w:t>Log in to your registrar and open DNS management for infinitysportspark.com.</w:t>
+        <w:t>Sign in to your registrar and open the DNS management page for infinitysportspark.com.</w:t>
       </w:r>
     </w:p>
     <w:p>
@@ -2874,7 +4039,22 @@
         <w:spacing w:after="60"/>
       </w:pPr>
       <w:r>
-        <w:t>Add / edit these records (use the static IP from Part 6a):</w:t>
+        <w:rPr>
+          <w:b w:val="0"/>
+        </w:rPr>
+        <w:t xml:space="preserve">Add (or edit) the two </w:t>
+      </w:r>
+      <w:r>
+        <w:rPr>
+          <w:b/>
+        </w:rPr>
+        <w:t>A</w:t>
+      </w:r>
+      <w:r>
+        <w:rPr>
+          <w:b w:val="0"/>
+        </w:rPr>
+        <w:t xml:space="preserve"> records below, using the static IP you wrote down in Part 6a. An A record maps a name to an IP:</w:t>
       </w:r>
     </w:p>
     <w:tbl>
@@ -2893,7 +4073,7 @@
       <w:tr>
         <w:tc>
           <w:tcPr>
-            <w:tcW w:type="dxa" w:w="1152"/>
+            <w:tcW w:type="dxa" w:w="1008"/>
             <w:shd w:val="clear" w:fill="0B1F3A"/>
           </w:tcPr>
           <w:p>
@@ -2910,7 +4090,7 @@
         </w:tc>
         <w:tc>
           <w:tcPr>
-            <w:tcW w:type="dxa" w:w="2448"/>
+            <w:tcW w:type="dxa" w:w="2736"/>
             <w:shd w:val="clear" w:fill="0B1F3A"/>
           </w:tcPr>
           <w:p>
@@ -2927,7 +4107,7 @@
         </w:tc>
         <w:tc>
           <w:tcPr>
-            <w:tcW w:type="dxa" w:w="3744"/>
+            <w:tcW w:type="dxa" w:w="3600"/>
             <w:shd w:val="clear" w:fill="0B1F3A"/>
           </w:tcPr>
           <w:p>
@@ -2938,7 +4118,7 @@
                 <w:color w:val="FFFFFF"/>
                 <w:sz w:val="20"/>
               </w:rPr>
-              <w:t>Value</w:t>
+              <w:t>Value (points to)</w:t>
             </w:r>
           </w:p>
         </w:tc>
@@ -2963,7 +4143,7 @@
       <w:tr>
         <w:tc>
           <w:tcPr>
-            <w:tcW w:type="dxa" w:w="1152"/>
+            <w:tcW w:type="dxa" w:w="1008"/>
           </w:tcPr>
           <w:p>
             <w:r/>
@@ -2977,7 +4157,7 @@
         </w:tc>
         <w:tc>
           <w:tcPr>
-            <w:tcW w:type="dxa" w:w="2448"/>
+            <w:tcW w:type="dxa" w:w="2736"/>
           </w:tcPr>
           <w:p>
             <w:r/>
@@ -2985,13 +4165,13 @@
               <w:rPr>
                 <w:sz w:val="20"/>
               </w:rPr>
-              <w:t>@  (or blank / apex)</w:t>
+              <w:t>@   (or leave blank = the apex)</w:t>
             </w:r>
           </w:p>
         </w:tc>
         <w:tc>
           <w:tcPr>
-            <w:tcW w:type="dxa" w:w="3744"/>
+            <w:tcW w:type="dxa" w:w="3600"/>
           </w:tcPr>
           <w:p>
             <w:r/>
@@ -3021,7 +4201,7 @@
       <w:tr>
         <w:tc>
           <w:tcPr>
-            <w:tcW w:type="dxa" w:w="1152"/>
+            <w:tcW w:type="dxa" w:w="1008"/>
           </w:tcPr>
           <w:p>
             <w:r/>
@@ -3035,7 +4215,7 @@
         </w:tc>
         <w:tc>
           <w:tcPr>
-            <w:tcW w:type="dxa" w:w="2448"/>
+            <w:tcW w:type="dxa" w:w="2736"/>
           </w:tcPr>
           <w:p>
             <w:r/>
@@ -3049,7 +4229,7 @@
         </w:tc>
         <w:tc>
           <w:tcPr>
-            <w:tcW w:type="dxa" w:w="3744"/>
+            <w:tcW w:type="dxa" w:w="3600"/>
           </w:tcPr>
           <w:p>
             <w:r/>
@@ -3071,7 +4251,7 @@
               <w:rPr>
                 <w:sz w:val="20"/>
               </w:rPr>
-              <w:t>The www version</w:t>
+              <w:t>The www. version</w:t>
             </w:r>
           </w:p>
         </w:tc>
@@ -3079,65 +4259,7 @@
       <w:tr>
         <w:tc>
           <w:tcPr>
-            <w:tcW w:type="dxa" w:w="1152"/>
-          </w:tcPr>
-          <w:p>
-            <w:r/>
-            <w:r>
-              <w:rPr>
-                <w:sz w:val="20"/>
-              </w:rPr>
-              <w:t>CNAME</w:t>
-            </w:r>
-          </w:p>
-        </w:tc>
-        <w:tc>
-          <w:tcPr>
-            <w:tcW w:type="dxa" w:w="2448"/>
-          </w:tcPr>
-          <w:p>
-            <w:r/>
-            <w:r>
-              <w:rPr>
-                <w:sz w:val="20"/>
-              </w:rPr>
-              <w:t>(from SES, Part 4)</w:t>
-            </w:r>
-          </w:p>
-        </w:tc>
-        <w:tc>
-          <w:tcPr>
-            <w:tcW w:type="dxa" w:w="3744"/>
-          </w:tcPr>
-          <w:p>
-            <w:r/>
-            <w:r>
-              <w:rPr>
-                <w:sz w:val="20"/>
-              </w:rPr>
-              <w:t>(from SES)</w:t>
-            </w:r>
-          </w:p>
-        </w:tc>
-        <w:tc>
-          <w:tcPr>
-            <w:tcW w:type="dxa" w:w="1872"/>
-          </w:tcPr>
-          <w:p>
-            <w:r/>
-            <w:r>
-              <w:rPr>
-                <w:sz w:val="20"/>
-              </w:rPr>
-              <w:t>Email DKIM — already added</w:t>
-            </w:r>
-          </w:p>
-        </w:tc>
-      </w:tr>
-      <w:tr>
-        <w:tc>
-          <w:tcPr>
-            <w:tcW w:type="dxa" w:w="1152"/>
+            <w:tcW w:type="dxa" w:w="1008"/>
           </w:tcPr>
           <w:p>
             <w:r/>
@@ -3151,7 +4273,7 @@
         </w:tc>
         <w:tc>
           <w:tcPr>
-            <w:tcW w:type="dxa" w:w="2448"/>
+            <w:tcW w:type="dxa" w:w="2736"/>
           </w:tcPr>
           <w:p>
             <w:r/>
@@ -3165,7 +4287,7 @@
         </w:tc>
         <w:tc>
           <w:tcPr>
-            <w:tcW w:type="dxa" w:w="3744"/>
+            <w:tcW w:type="dxa" w:w="3600"/>
           </w:tcPr>
           <w:p>
             <w:r/>
@@ -3200,6 +4322,45 @@
     </w:p>
     <w:p>
       <w:pPr>
+        <w:spacing w:after="120"/>
+      </w:pPr>
+      <w:r>
+        <w:rPr>
+          <w:b w:val="0"/>
+          <w:i/>
+          <w:color w:val="555555"/>
+          <w:sz w:val="22"/>
+        </w:rPr>
+        <w:t>(The 3 SES DKIM CNAME records from Part 4a should already be here — leave them.)</w:t>
+      </w:r>
+    </w:p>
+    <w:p>
+      <w:pPr>
+        <w:spacing w:after="160"/>
+        <w:shd w:val="clear" w:color="auto" w:fill="FDECEA"/>
+        <w:pBdr>
+          <w:top w:val="single" w:sz="6" w:space="6" w:color="D0D0D0"/>
+          <w:left w:val="single" w:sz="6" w:space="6" w:color="D0D0D0"/>
+          <w:bottom w:val="single" w:sz="6" w:space="6" w:color="D0D0D0"/>
+          <w:right w:val="single" w:sz="6" w:space="6" w:color="D0D0D0"/>
+        </w:pBdr>
+      </w:pPr>
+      <w:r>
+        <w:rPr>
+          <w:b/>
+          <w:sz w:val="21"/>
+        </w:rPr>
+        <w:t xml:space="preserve">IMPORTANT: </w:t>
+      </w:r>
+      <w:r>
+        <w:rPr>
+          <w:sz w:val="21"/>
+        </w:rPr>
+        <w:t>If your registrar won’t accept “@” for the apex, leave the Name/Host box blank instead. Some registrars don’t allow an A record at the apex — in that case use their “forwarding” to send the bare domain to www, or switch DNS to Route 53 (note at the end).</w:t>
+      </w:r>
+    </w:p>
+    <w:p>
+      <w:pPr>
         <w:pStyle w:val="ListNumber"/>
         <w:spacing w:after="60"/>
       </w:pPr>
@@ -3207,7 +4368,7 @@
         <w:rPr>
           <w:b w:val="0"/>
         </w:rPr>
-        <w:t xml:space="preserve">Wait for DNS to take effect (minutes–hours). Test by visiting </w:t>
+        <w:t xml:space="preserve">Wait for DNS to propagate (a few minutes to a few hours). Test by visiting </w:t>
       </w:r>
       <w:r>
         <w:rPr>
@@ -3221,7 +4382,7 @@
         <w:rPr>
           <w:b w:val="0"/>
         </w:rPr>
-        <w:t xml:space="preserve"> — the site should load (not secure yet).</w:t>
+        <w:t xml:space="preserve"> — the site should load (the browser will say “Not secure” for now; HTTPS is the next step).</w:t>
       </w:r>
     </w:p>
     <w:p>
@@ -3230,7 +4391,7 @@
         <w:spacing w:after="60"/>
       </w:pPr>
       <w:r>
-        <w:t>Back in the SSH terminal, turn on HTTPS:</w:t>
+        <w:t>Once the site loads over http, go back to the SSH terminal and turn on HTTPS with a free certificate:</w:t>
       </w:r>
     </w:p>
     <w:p>
@@ -3258,7 +4419,46 @@
         <w:spacing w:after="60"/>
       </w:pPr>
       <w:r>
-        <w:t>Answer the prompts (enter your email, agree to terms, choose to redirect HTTP→HTTPS).</w:t>
+        <w:rPr>
+          <w:b w:val="0"/>
+        </w:rPr>
+        <w:t xml:space="preserve">Answer the prompts: type your email, press </w:t>
+      </w:r>
+      <w:r>
+        <w:rPr>
+          <w:b/>
+        </w:rPr>
+        <w:t>A</w:t>
+      </w:r>
+      <w:r>
+        <w:rPr>
+          <w:b w:val="0"/>
+        </w:rPr>
+        <w:t xml:space="preserve"> to agree to the terms, </w:t>
+      </w:r>
+      <w:r>
+        <w:rPr>
+          <w:b/>
+        </w:rPr>
+        <w:t>N</w:t>
+      </w:r>
+      <w:r>
+        <w:rPr>
+          <w:b w:val="0"/>
+        </w:rPr>
+        <w:t xml:space="preserve"> to the newsletter, and choose the </w:t>
+      </w:r>
+      <w:r>
+        <w:rPr>
+          <w:b/>
+        </w:rPr>
+        <w:t>Redirect</w:t>
+      </w:r>
+      <w:r>
+        <w:rPr>
+          <w:b w:val="0"/>
+        </w:rPr>
+        <w:t xml:space="preserve"> option so http:// forwards to https://.</w:t>
       </w:r>
     </w:p>
     <w:p>
@@ -3283,7 +4483,7 @@
         <w:rPr>
           <w:sz w:val="20"/>
         </w:rPr>
-        <w:t>“Congratulations! ... certificate ... deployed.” Now https:// works with a padlock.</w:t>
+        <w:t>“Congratulations! Your certificate and chain have been saved… deployed.” Reload the site — it now shows a padlock.</w:t>
       </w:r>
     </w:p>
     <w:p>
@@ -3308,7 +4508,7 @@
         <w:rPr>
           <w:sz w:val="21"/>
         </w:rPr>
-        <w:t>Prefer to use Amazon Route 53 for DNS instead of your registrar? Create a hosted zone for the domain ($0.50/mo), change your registrar’s nameservers to the 4 Route 53 values, then add the same A/CNAME/TXT records there.</w:t>
+        <w:t>Prefer Amazon Route 53 for DNS (so it’s all in AWS)? Search “Route 53” → Hosted zones → Create hosted zone for infinitysportspark.com ($0.50/mo). Route 53 shows 4 nameservers; set those as the domain’s nameservers at the registrar, then add the same A / CNAME / TXT records inside the Route 53 zone.</w:t>
       </w:r>
     </w:p>
     <w:p>

</xml_diff>